<commit_message>
Supports de formation et de recette : guides Word par profil, cahier de recette
- docs/outils/md-docx.js : conversion Markdown vers Word aux couleurs du projet, partagée
  par le dossier de conception et les guides.
- docs/guides/build.js : un guide Word par profil (docs/guides/word/), avec la section
  commune de connexion ; guides complétés pour les deux sociétés (sélecteur, vue groupe,
  sociétés ouvertes par utilisateur).
- docs/projet/cahier-de-recette.py : Cahier_de_recette.xlsx, 55 scénarios (vingt attentes,
  AxisPro, reprise, multi-sociétés), statut à choisir, synthèse calculée par attente.

Co-Authored-By: Claude Opus 5.5 <noreply@anthropic.com>
</commit_message>
<xml_diff>
--- a/docs/projet/Dossier_de_conception.docx
+++ b/docs/projet/Dossier_de_conception.docx
@@ -65,7 +65,7 @@
     </w:p>
     <w:p>
       <w:pPr>
-        <w:spacing w:after="100" w:before="0"/>
+        <w:spacing w:after="100"/>
         <w:jc w:val="both"/>
       </w:pPr>
       <w:r>
@@ -99,7 +99,7 @@
     </w:p>
     <w:p>
       <w:pPr>
-        <w:spacing w:after="100" w:before="0"/>
+        <w:spacing w:after="100"/>
         <w:jc w:val="both"/>
       </w:pPr>
       <w:r>
@@ -269,7 +269,7 @@
     </w:p>
     <w:p>
       <w:pPr>
-        <w:spacing w:after="100" w:before="0"/>
+        <w:spacing w:after="100"/>
         <w:jc w:val="both"/>
       </w:pPr>
       <w:r>
@@ -790,7 +790,7 @@
     </w:p>
     <w:p>
       <w:pPr>
-        <w:spacing w:after="100" w:before="0"/>
+        <w:spacing w:after="100"/>
         <w:jc w:val="both"/>
       </w:pPr>
       <w:r>
@@ -1869,7 +1869,7 @@
     </w:p>
     <w:p>
       <w:pPr>
-        <w:spacing w:after="100" w:before="0"/>
+        <w:spacing w:after="100"/>
         <w:jc w:val="both"/>
       </w:pPr>
       <w:r>
@@ -2891,7 +2891,7 @@
     </w:p>
     <w:p>
       <w:pPr>
-        <w:spacing w:after="100" w:before="0"/>
+        <w:spacing w:after="100"/>
         <w:jc w:val="both"/>
       </w:pPr>
       <w:r>
@@ -3079,7 +3079,7 @@
     </w:p>
     <w:p>
       <w:pPr>
-        <w:spacing w:after="100" w:before="0"/>
+        <w:spacing w:after="100"/>
         <w:jc w:val="both"/>
       </w:pPr>
       <w:r>

</xml_diff>

<commit_message>
Documents de projet : sécurité renforcée, quittancement, état du 14 octobre
Dossier de conception : règles du quittancement et des pièces déposées,
chapitre sécurité complété (sessions, cloisonnement, approbations,
fichiers, exports, téléphone du parc, politique de contenu). Cahier de
recette : quatre scénarios ajoutés (pièce modifiée après accord,
déconnexion de Rotations, dépôts refusés, cloisonnement d'AxisPro), 59
au total. ETAT.md : troisième revue de sécurité, 97 tests, version
20261014-1502 en production, prochaines étapes.

Co-Authored-By: Claude Opus 5.5 <noreply@anthropic.com>
</commit_message>
<xml_diff>
--- a/docs/projet/Dossier_de_conception.docx
+++ b/docs/projet/Dossier_de_conception.docx
@@ -2265,8 +2265,8 @@
         </w:tblBorders>
       </w:tblPr>
       <w:tblGrid>
-        <w:gridCol w:w="2084"/>
-        <w:gridCol w:w="7554"/>
+        <w:gridCol w:w="2011"/>
+        <w:gridCol w:w="7627"/>
       </w:tblGrid>
       <w:tr>
         <w:trPr>
@@ -2274,7 +2274,7 @@
         </w:trPr>
         <w:tc>
           <w:tcPr>
-            <w:tcW w:type="dxa" w:w="2084"/>
+            <w:tcW w:type="dxa" w:w="2011"/>
             <w:tcBorders>
               <w:top w:val="single" w:color="C9CFD8" w:sz="4"/>
               <w:left w:val="single" w:color="C9CFD8" w:sz="4"/>
@@ -2309,7 +2309,7 @@
         </w:tc>
         <w:tc>
           <w:tcPr>
-            <w:tcW w:type="dxa" w:w="7554"/>
+            <w:tcW w:type="dxa" w:w="7627"/>
             <w:tcBorders>
               <w:top w:val="single" w:color="C9CFD8" w:sz="4"/>
               <w:left w:val="single" w:color="C9CFD8" w:sz="4"/>
@@ -2346,7 +2346,7 @@
       <w:tr>
         <w:tc>
           <w:tcPr>
-            <w:tcW w:type="dxa" w:w="2084"/>
+            <w:tcW w:type="dxa" w:w="2011"/>
             <w:tcBorders>
               <w:top w:val="single" w:color="C9CFD8" w:sz="4"/>
               <w:left w:val="single" w:color="C9CFD8" w:sz="4"/>
@@ -2377,7 +2377,7 @@
         </w:tc>
         <w:tc>
           <w:tcPr>
-            <w:tcW w:type="dxa" w:w="7554"/>
+            <w:tcW w:type="dxa" w:w="7627"/>
             <w:tcBorders>
               <w:top w:val="single" w:color="C9CFD8" w:sz="4"/>
               <w:left w:val="single" w:color="C9CFD8" w:sz="4"/>
@@ -2410,7 +2410,7 @@
       <w:tr>
         <w:tc>
           <w:tcPr>
-            <w:tcW w:type="dxa" w:w="2084"/>
+            <w:tcW w:type="dxa" w:w="2011"/>
             <w:tcBorders>
               <w:top w:val="single" w:color="C9CFD8" w:sz="4"/>
               <w:left w:val="single" w:color="C9CFD8" w:sz="4"/>
@@ -2442,7 +2442,7 @@
         </w:tc>
         <w:tc>
           <w:tcPr>
-            <w:tcW w:type="dxa" w:w="7554"/>
+            <w:tcW w:type="dxa" w:w="7627"/>
             <w:tcBorders>
               <w:top w:val="single" w:color="C9CFD8" w:sz="4"/>
               <w:left w:val="single" w:color="C9CFD8" w:sz="4"/>
@@ -2476,7 +2476,7 @@
       <w:tr>
         <w:tc>
           <w:tcPr>
-            <w:tcW w:type="dxa" w:w="2084"/>
+            <w:tcW w:type="dxa" w:w="2011"/>
             <w:tcBorders>
               <w:top w:val="single" w:color="C9CFD8" w:sz="4"/>
               <w:left w:val="single" w:color="C9CFD8" w:sz="4"/>
@@ -2507,7 +2507,7 @@
         </w:tc>
         <w:tc>
           <w:tcPr>
-            <w:tcW w:type="dxa" w:w="7554"/>
+            <w:tcW w:type="dxa" w:w="7627"/>
             <w:tcBorders>
               <w:top w:val="single" w:color="C9CFD8" w:sz="4"/>
               <w:left w:val="single" w:color="C9CFD8" w:sz="4"/>
@@ -2540,7 +2540,7 @@
       <w:tr>
         <w:tc>
           <w:tcPr>
-            <w:tcW w:type="dxa" w:w="2084"/>
+            <w:tcW w:type="dxa" w:w="2011"/>
             <w:tcBorders>
               <w:top w:val="single" w:color="C9CFD8" w:sz="4"/>
               <w:left w:val="single" w:color="C9CFD8" w:sz="4"/>
@@ -2572,7 +2572,7 @@
         </w:tc>
         <w:tc>
           <w:tcPr>
-            <w:tcW w:type="dxa" w:w="7554"/>
+            <w:tcW w:type="dxa" w:w="7627"/>
             <w:tcBorders>
               <w:top w:val="single" w:color="C9CFD8" w:sz="4"/>
               <w:left w:val="single" w:color="C9CFD8" w:sz="4"/>
@@ -2606,7 +2606,7 @@
       <w:tr>
         <w:tc>
           <w:tcPr>
-            <w:tcW w:type="dxa" w:w="2084"/>
+            <w:tcW w:type="dxa" w:w="2011"/>
             <w:tcBorders>
               <w:top w:val="single" w:color="C9CFD8" w:sz="4"/>
               <w:left w:val="single" w:color="C9CFD8" w:sz="4"/>
@@ -2637,7 +2637,7 @@
         </w:tc>
         <w:tc>
           <w:tcPr>
-            <w:tcW w:type="dxa" w:w="7554"/>
+            <w:tcW w:type="dxa" w:w="7627"/>
             <w:tcBorders>
               <w:top w:val="single" w:color="C9CFD8" w:sz="4"/>
               <w:left w:val="single" w:color="C9CFD8" w:sz="4"/>
@@ -2670,7 +2670,7 @@
       <w:tr>
         <w:tc>
           <w:tcPr>
-            <w:tcW w:type="dxa" w:w="2084"/>
+            <w:tcW w:type="dxa" w:w="2011"/>
             <w:tcBorders>
               <w:top w:val="single" w:color="C9CFD8" w:sz="4"/>
               <w:left w:val="single" w:color="C9CFD8" w:sz="4"/>
@@ -2702,7 +2702,7 @@
         </w:tc>
         <w:tc>
           <w:tcPr>
-            <w:tcW w:type="dxa" w:w="7554"/>
+            <w:tcW w:type="dxa" w:w="7627"/>
             <w:tcBorders>
               <w:top w:val="single" w:color="C9CFD8" w:sz="4"/>
               <w:left w:val="single" w:color="C9CFD8" w:sz="4"/>
@@ -2736,7 +2736,7 @@
       <w:tr>
         <w:tc>
           <w:tcPr>
-            <w:tcW w:type="dxa" w:w="2084"/>
+            <w:tcW w:type="dxa" w:w="2011"/>
             <w:tcBorders>
               <w:top w:val="single" w:color="C9CFD8" w:sz="4"/>
               <w:left w:val="single" w:color="C9CFD8" w:sz="4"/>
@@ -2767,7 +2767,7 @@
         </w:tc>
         <w:tc>
           <w:tcPr>
-            <w:tcW w:type="dxa" w:w="7554"/>
+            <w:tcW w:type="dxa" w:w="7627"/>
             <w:tcBorders>
               <w:top w:val="single" w:color="C9CFD8" w:sz="4"/>
               <w:left w:val="single" w:color="C9CFD8" w:sz="4"/>
@@ -2800,7 +2800,7 @@
       <w:tr>
         <w:tc>
           <w:tcPr>
-            <w:tcW w:type="dxa" w:w="2084"/>
+            <w:tcW w:type="dxa" w:w="2011"/>
             <w:tcBorders>
               <w:top w:val="single" w:color="C9CFD8" w:sz="4"/>
               <w:left w:val="single" w:color="C9CFD8" w:sz="4"/>
@@ -2826,13 +2826,143 @@
                 <w:sz w:val="17"/>
                 <w:szCs w:val="17"/>
               </w:rPr>
+              <w:t xml:space="preserve">Immobilier</w:t>
+            </w:r>
+          </w:p>
+        </w:tc>
+        <w:tc>
+          <w:tcPr>
+            <w:tcW w:type="dxa" w:w="7627"/>
+            <w:tcBorders>
+              <w:top w:val="single" w:color="C9CFD8" w:sz="4"/>
+              <w:left w:val="single" w:color="C9CFD8" w:sz="4"/>
+              <w:bottom w:val="single" w:color="C9CFD8" w:sz="4"/>
+              <w:right w:val="single" w:color="C9CFD8" w:sz="4"/>
+            </w:tcBorders>
+            <w:shd w:fill="F2F4F7" w:color="auto" w:val="clear"/>
+            <w:tcMar>
+              <w:top w:type="dxa" w:w="50"/>
+              <w:left w:type="dxa" w:w="90"/>
+              <w:bottom w:type="dxa" w:w="50"/>
+              <w:right w:type="dxa" w:w="90"/>
+            </w:tcMar>
+            <w:vAlign w:val="center"/>
+          </w:tcPr>
+          <w:p>
+            <w:pPr>
+              <w:spacing w:after="0"/>
+            </w:pPr>
+            <w:r>
+              <w:rPr>
+                <w:rFonts w:ascii="Calibri" w:cs="Calibri" w:eastAsia="Calibri" w:hAnsi="Calibri"/>
+                <w:sz w:val="17"/>
+                <w:szCs w:val="17"/>
+              </w:rPr>
+              <w:t xml:space="preserve">quittancement chaque nuit : une facture par échéance passée, datée de l'échéance, validée aussitôt (rattrapage compris) ; impayés relancés comme les autres créances</w:t>
+            </w:r>
+          </w:p>
+        </w:tc>
+      </w:tr>
+      <w:tr>
+        <w:tc>
+          <w:tcPr>
+            <w:tcW w:type="dxa" w:w="2011"/>
+            <w:tcBorders>
+              <w:top w:val="single" w:color="C9CFD8" w:sz="4"/>
+              <w:left w:val="single" w:color="C9CFD8" w:sz="4"/>
+              <w:bottom w:val="single" w:color="C9CFD8" w:sz="4"/>
+              <w:right w:val="single" w:color="C9CFD8" w:sz="4"/>
+            </w:tcBorders>
+            <w:tcMar>
+              <w:top w:type="dxa" w:w="50"/>
+              <w:left w:type="dxa" w:w="90"/>
+              <w:bottom w:type="dxa" w:w="50"/>
+              <w:right w:type="dxa" w:w="90"/>
+            </w:tcMar>
+            <w:vAlign w:val="center"/>
+          </w:tcPr>
+          <w:p>
+            <w:pPr>
+              <w:spacing w:after="0"/>
+            </w:pPr>
+            <w:r>
+              <w:rPr>
+                <w:rFonts w:ascii="Calibri" w:cs="Calibri" w:eastAsia="Calibri" w:hAnsi="Calibri"/>
+                <w:sz w:val="17"/>
+                <w:szCs w:val="17"/>
+              </w:rPr>
+              <w:t xml:space="preserve">Pièces déposées</w:t>
+            </w:r>
+          </w:p>
+        </w:tc>
+        <w:tc>
+          <w:tcPr>
+            <w:tcW w:type="dxa" w:w="7627"/>
+            <w:tcBorders>
+              <w:top w:val="single" w:color="C9CFD8" w:sz="4"/>
+              <w:left w:val="single" w:color="C9CFD8" w:sz="4"/>
+              <w:bottom w:val="single" w:color="C9CFD8" w:sz="4"/>
+              <w:right w:val="single" w:color="C9CFD8" w:sz="4"/>
+            </w:tcBorders>
+            <w:tcMar>
+              <w:top w:type="dxa" w:w="50"/>
+              <w:left w:type="dxa" w:w="90"/>
+              <w:bottom w:type="dxa" w:w="50"/>
+              <w:right w:type="dxa" w:w="90"/>
+            </w:tcMar>
+            <w:vAlign w:val="center"/>
+          </w:tcPr>
+          <w:p>
+            <w:pPr>
+              <w:spacing w:after="0"/>
+            </w:pPr>
+            <w:r>
+              <w:rPr>
+                <w:rFonts w:ascii="Calibri" w:cs="Calibri" w:eastAsia="Calibri" w:hAnsi="Calibri"/>
+                <w:sz w:val="17"/>
+                <w:szCs w:val="17"/>
+              </w:rPr>
+              <w:t xml:space="preserve">PDF, JPEG, PNG, Word .docx et Excel .xlsx, reconnus d'après leur contenu ; 20 Mo par fichier ; dossier d'un porteur limité à 400 pièces ou 1 Go, 50 messages par jour</w:t>
+            </w:r>
+          </w:p>
+        </w:tc>
+      </w:tr>
+      <w:tr>
+        <w:tc>
+          <w:tcPr>
+            <w:tcW w:type="dxa" w:w="2011"/>
+            <w:tcBorders>
+              <w:top w:val="single" w:color="C9CFD8" w:sz="4"/>
+              <w:left w:val="single" w:color="C9CFD8" w:sz="4"/>
+              <w:bottom w:val="single" w:color="C9CFD8" w:sz="4"/>
+              <w:right w:val="single" w:color="C9CFD8" w:sz="4"/>
+            </w:tcBorders>
+            <w:shd w:fill="F2F4F7" w:color="auto" w:val="clear"/>
+            <w:tcMar>
+              <w:top w:type="dxa" w:w="50"/>
+              <w:left w:type="dxa" w:w="90"/>
+              <w:bottom w:type="dxa" w:w="50"/>
+              <w:right w:type="dxa" w:w="90"/>
+            </w:tcMar>
+            <w:vAlign w:val="center"/>
+          </w:tcPr>
+          <w:p>
+            <w:pPr>
+              <w:spacing w:after="0"/>
+            </w:pPr>
+            <w:r>
+              <w:rPr>
+                <w:rFonts w:ascii="Calibri" w:cs="Calibri" w:eastAsia="Calibri" w:hAnsi="Calibri"/>
+                <w:sz w:val="17"/>
+                <w:szCs w:val="17"/>
+              </w:rPr>
               <w:t xml:space="preserve">AxisPro</w:t>
             </w:r>
           </w:p>
         </w:tc>
         <w:tc>
           <w:tcPr>
-            <w:tcW w:type="dxa" w:w="7554"/>
+            <w:tcW w:type="dxa" w:w="7627"/>
             <w:tcBorders>
               <w:top w:val="single" w:color="C9CFD8" w:sz="4"/>
               <w:left w:val="single" w:color="C9CFD8" w:sz="4"/>
@@ -2900,7 +3030,21 @@
           <w:sz w:val="20"/>
           <w:szCs w:val="20"/>
         </w:rPr>
-        <w:t xml:space="preserve">Double authentification pour tous les utilisateurs (y compris le portail et l'application Rotations), mots de passe d'au moins 10 caractères, mot de passe provisoire à remplacer avant tout accès, sessions courtes et révocables, limitation des essais par identifiant et par adresse, journal des accès conservé 12 mois, piste d'audit avec valeurs avant et après, échanges chiffrés (TLS), noyau et base jamais exposés sur Internet, client web du noyau réservé aux adresses de l'équipe technique.</w:t>
+        <w:t xml:space="preserve">Double authentification pour tous les utilisateurs (y compris le portail et l'application Rotations), mots de passe d'au moins 10 caractères, mot de passe provisoire à remplacer avant tout accès, sessions courtes et révocables (accès 15 minutes, session de 7 jours au plus, 90 jours pour les agents du parc dans Rotations), déconnexion qui ferme toute la session, limitation des essais par identifiant et par adresse, journal des accès conservé 12 mois, piste d'audit avec valeurs avant et après, échanges chiffrés (TLS), noyau et base jamais exposés sur Internet, client web du noyau réservé aux adresses de l'équipe technique.</w:t>
+      </w:r>
+    </w:p>
+    <w:p>
+      <w:pPr>
+        <w:spacing w:after="100"/>
+        <w:jc w:val="both"/>
+      </w:pPr>
+      <w:r>
+        <w:rPr>
+          <w:rFonts w:ascii="Calibri" w:cs="Calibri" w:eastAsia="Calibri" w:hAnsi="Calibri"/>
+          <w:sz w:val="20"/>
+          <w:szCs w:val="20"/>
+        </w:rPr>
+        <w:t xml:space="preserve">Chaque société ne voit que ses propres données, jusque dans les pièces de la data room, les revues de comité et les grilles du cabinet. Une pièce approuvée puis modifiée doit être approuvée à nouveau. Les fichiers déposés sont contrôlés d'après leur contenu (les documents à macros sont refusés) et toujours servis en téléchargement ; les exports pour tableur ne contiennent jamais de formule. Le téléphone d'un agent du parc ne garde ni tarifs ni marges, et s'efface à la déconnexion. Les applications appliquent une politique de sécurité du contenu (aucun script ni appel vers un site tiers).</w:t>
       </w:r>
     </w:p>
     <w:p>

</xml_diff>

<commit_message>
Dossier de conception : règles et vingt attentes mises à jour (prototypes de la direction, courrier du responsable financier)
Co-Authored-By: Claude Opus 5.5 <noreply@anthropic.com>
</commit_message>
<xml_diff>
--- a/docs/projet/Dossier_de_conception.docx
+++ b/docs/projet/Dossier_de_conception.docx
@@ -74,7 +74,7 @@
           <w:sz w:val="20"/>
           <w:szCs w:val="20"/>
         </w:rPr>
-        <w:t xml:space="preserve">Projet de document, version de travail du 14 octobre 2026, à relire par le gérant avant envoi au client. Référence : offre OTF-EGUITRA-2026-37. Objet : arrêter la conception (offre, chapitre 6.2, jalon de la semaine 1) et la liste définitive des composants (offre, chapitre 3.8). Les montants et délais de l'offre ne changent pas.</w:t>
+        <w:t xml:space="preserve">Projet de document, version de travail du 17 octobre 2026, à relire par le gérant avant envoi au client. Il intègre les prototypes de la direction (M. Diallo, DGA), adoptés comme cahier des charges (offre, § 2.3), et le courrier du responsable financier (M. Kalissa) énumérant les vingt attentes. Référence : offre OTF-EGUITRA-2026-37. Objet : arrêter la conception (offre, chapitre 6.2, jalon de la semaine 1) et la liste définitive des composants (offre, chapitre 3.8). Les montants et délais de l'offre ne changent pas.</w:t>
       </w:r>
     </w:p>
     <w:p>
@@ -186,7 +186,7 @@
           <w:sz w:val="20"/>
           <w:szCs w:val="20"/>
         </w:rPr>
-        <w:t xml:space="preserve"> : évaluation des projets par stage gates, scoring, data room, comités, rapports, temps et honoraires du cabinet.</w:t>
+        <w:t xml:space="preserve"> : évaluation des projets selon la méthode MB AxisPro (stage gates, scoring Readiness et Bankability, knock-outs, écarts prioritaires), data room, comités et décisions scellées, rapports, modèle financier, risques et plan d'actions, temps et honoraires du cabinet.</w:t>
       </w:r>
     </w:p>
     <w:p>
@@ -2265,8 +2265,8 @@
         </w:tblBorders>
       </w:tblPr>
       <w:tblGrid>
-        <w:gridCol w:w="2011"/>
-        <w:gridCol w:w="7627"/>
+        <w:gridCol w:w="3124"/>
+        <w:gridCol w:w="6514"/>
       </w:tblGrid>
       <w:tr>
         <w:trPr>
@@ -2274,7 +2274,7 @@
         </w:trPr>
         <w:tc>
           <w:tcPr>
-            <w:tcW w:type="dxa" w:w="2011"/>
+            <w:tcW w:type="dxa" w:w="3124"/>
             <w:tcBorders>
               <w:top w:val="single" w:color="C9CFD8" w:sz="4"/>
               <w:left w:val="single" w:color="C9CFD8" w:sz="4"/>
@@ -2309,7 +2309,7 @@
         </w:tc>
         <w:tc>
           <w:tcPr>
-            <w:tcW w:type="dxa" w:w="7627"/>
+            <w:tcW w:type="dxa" w:w="6514"/>
             <w:tcBorders>
               <w:top w:val="single" w:color="C9CFD8" w:sz="4"/>
               <w:left w:val="single" w:color="C9CFD8" w:sz="4"/>
@@ -2346,63 +2346,63 @@
       <w:tr>
         <w:tc>
           <w:tcPr>
-            <w:tcW w:type="dxa" w:w="2011"/>
-            <w:tcBorders>
-              <w:top w:val="single" w:color="C9CFD8" w:sz="4"/>
-              <w:left w:val="single" w:color="C9CFD8" w:sz="4"/>
-              <w:bottom w:val="single" w:color="C9CFD8" w:sz="4"/>
-              <w:right w:val="single" w:color="C9CFD8" w:sz="4"/>
-            </w:tcBorders>
-            <w:tcMar>
-              <w:top w:type="dxa" w:w="50"/>
-              <w:left w:type="dxa" w:w="90"/>
-              <w:bottom w:type="dxa" w:w="50"/>
-              <w:right w:type="dxa" w:w="90"/>
-            </w:tcMar>
-            <w:vAlign w:val="center"/>
-          </w:tcPr>
-          <w:p>
-            <w:pPr>
-              <w:spacing w:after="0"/>
-            </w:pPr>
-            <w:r>
-              <w:rPr>
-                <w:rFonts w:ascii="Calibri" w:cs="Calibri" w:eastAsia="Calibri" w:hAnsi="Calibri"/>
-                <w:sz w:val="17"/>
-                <w:szCs w:val="17"/>
-              </w:rPr>
-              <w:t xml:space="preserve">Approbation des pièces d'achat</w:t>
-            </w:r>
-          </w:p>
-        </w:tc>
-        <w:tc>
-          <w:tcPr>
-            <w:tcW w:type="dxa" w:w="7627"/>
-            <w:tcBorders>
-              <w:top w:val="single" w:color="C9CFD8" w:sz="4"/>
-              <w:left w:val="single" w:color="C9CFD8" w:sz="4"/>
-              <w:bottom w:val="single" w:color="C9CFD8" w:sz="4"/>
-              <w:right w:val="single" w:color="C9CFD8" w:sz="4"/>
-            </w:tcBorders>
-            <w:tcMar>
-              <w:top w:type="dxa" w:w="50"/>
-              <w:left w:type="dxa" w:w="90"/>
-              <w:bottom w:type="dxa" w:w="50"/>
-              <w:right w:type="dxa" w:w="90"/>
-            </w:tcMar>
-            <w:vAlign w:val="center"/>
-          </w:tcPr>
-          <w:p>
-            <w:pPr>
-              <w:spacing w:after="0"/>
-            </w:pPr>
-            <w:r>
-              <w:rPr>
-                <w:rFonts w:ascii="Calibri" w:cs="Calibri" w:eastAsia="Calibri" w:hAnsi="Calibri"/>
-                <w:sz w:val="17"/>
-                <w:szCs w:val="17"/>
-              </w:rPr>
-              <w:t xml:space="preserve">toutes : contrôle de la finance ; au-delà de 50 M GNF : accord de la direction</w:t>
+            <w:tcW w:type="dxa" w:w="3124"/>
+            <w:tcBorders>
+              <w:top w:val="single" w:color="C9CFD8" w:sz="4"/>
+              <w:left w:val="single" w:color="C9CFD8" w:sz="4"/>
+              <w:bottom w:val="single" w:color="C9CFD8" w:sz="4"/>
+              <w:right w:val="single" w:color="C9CFD8" w:sz="4"/>
+            </w:tcBorders>
+            <w:tcMar>
+              <w:top w:type="dxa" w:w="50"/>
+              <w:left w:type="dxa" w:w="90"/>
+              <w:bottom w:type="dxa" w:w="50"/>
+              <w:right w:type="dxa" w:w="90"/>
+            </w:tcMar>
+            <w:vAlign w:val="center"/>
+          </w:tcPr>
+          <w:p>
+            <w:pPr>
+              <w:spacing w:after="0"/>
+            </w:pPr>
+            <w:r>
+              <w:rPr>
+                <w:rFonts w:ascii="Calibri" w:cs="Calibri" w:eastAsia="Calibri" w:hAnsi="Calibri"/>
+                <w:sz w:val="17"/>
+                <w:szCs w:val="17"/>
+              </w:rPr>
+              <w:t xml:space="preserve">Engagements de dépense</w:t>
+            </w:r>
+          </w:p>
+        </w:tc>
+        <w:tc>
+          <w:tcPr>
+            <w:tcW w:type="dxa" w:w="6514"/>
+            <w:tcBorders>
+              <w:top w:val="single" w:color="C9CFD8" w:sz="4"/>
+              <w:left w:val="single" w:color="C9CFD8" w:sz="4"/>
+              <w:bottom w:val="single" w:color="C9CFD8" w:sz="4"/>
+              <w:right w:val="single" w:color="C9CFD8" w:sz="4"/>
+            </w:tcBorders>
+            <w:tcMar>
+              <w:top w:type="dxa" w:w="50"/>
+              <w:left w:type="dxa" w:w="90"/>
+              <w:bottom w:type="dxa" w:w="50"/>
+              <w:right w:type="dxa" w:w="90"/>
+            </w:tcMar>
+            <w:vAlign w:val="center"/>
+          </w:tcPr>
+          <w:p>
+            <w:pPr>
+              <w:spacing w:after="0"/>
+            </w:pPr>
+            <w:r>
+              <w:rPr>
+                <w:rFonts w:ascii="Calibri" w:cs="Calibri" w:eastAsia="Calibri" w:hAnsi="Calibri"/>
+                <w:sz w:val="17"/>
+                <w:szCs w:val="17"/>
+              </w:rPr>
+              <w:t xml:space="preserve">approuvés avant la commande, devis joint : contrôle de la finance ; au-delà de 50 M GNF : accord de la direction ; les factures du fournisseur consomment l'engagement sans refaire le circuit, dans la limite du reste à engager (tolérance 5 %)</w:t>
             </w:r>
           </w:p>
         </w:tc>
@@ -2410,7 +2410,7 @@
       <w:tr>
         <w:tc>
           <w:tcPr>
-            <w:tcW w:type="dxa" w:w="2011"/>
+            <w:tcW w:type="dxa" w:w="3124"/>
             <w:tcBorders>
               <w:top w:val="single" w:color="C9CFD8" w:sz="4"/>
               <w:left w:val="single" w:color="C9CFD8" w:sz="4"/>
@@ -2436,13 +2436,13 @@
                 <w:sz w:val="17"/>
                 <w:szCs w:val="17"/>
               </w:rPr>
-              <w:t xml:space="preserve">Approbation des règlements</w:t>
-            </w:r>
-          </w:p>
-        </w:tc>
-        <w:tc>
-          <w:tcPr>
-            <w:tcW w:type="dxa" w:w="7627"/>
+              <w:t xml:space="preserve">Approbation des pièces d'achat</w:t>
+            </w:r>
+          </w:p>
+        </w:tc>
+        <w:tc>
+          <w:tcPr>
+            <w:tcW w:type="dxa" w:w="6514"/>
             <w:tcBorders>
               <w:top w:val="single" w:color="C9CFD8" w:sz="4"/>
               <w:left w:val="single" w:color="C9CFD8" w:sz="4"/>
@@ -2468,7 +2468,7 @@
                 <w:sz w:val="17"/>
                 <w:szCs w:val="17"/>
               </w:rPr>
-              <w:t xml:space="preserve">au-delà de 100 M GNF : accord de la direction</w:t>
+              <w:t xml:space="preserve">toutes : contrôle de la finance ; au-delà de 50 M GNF : accord de la direction</w:t>
             </w:r>
           </w:p>
         </w:tc>
@@ -2476,63 +2476,63 @@
       <w:tr>
         <w:tc>
           <w:tcPr>
-            <w:tcW w:type="dxa" w:w="2011"/>
-            <w:tcBorders>
-              <w:top w:val="single" w:color="C9CFD8" w:sz="4"/>
-              <w:left w:val="single" w:color="C9CFD8" w:sz="4"/>
-              <w:bottom w:val="single" w:color="C9CFD8" w:sz="4"/>
-              <w:right w:val="single" w:color="C9CFD8" w:sz="4"/>
-            </w:tcBorders>
-            <w:tcMar>
-              <w:top w:type="dxa" w:w="50"/>
-              <w:left w:type="dxa" w:w="90"/>
-              <w:bottom w:type="dxa" w:w="50"/>
-              <w:right w:type="dxa" w:w="90"/>
-            </w:tcMar>
-            <w:vAlign w:val="center"/>
-          </w:tcPr>
-          <w:p>
-            <w:pPr>
-              <w:spacing w:after="0"/>
-            </w:pPr>
-            <w:r>
-              <w:rPr>
-                <w:rFonts w:ascii="Calibri" w:cs="Calibri" w:eastAsia="Calibri" w:hAnsi="Calibri"/>
-                <w:sz w:val="17"/>
-                <w:szCs w:val="17"/>
-              </w:rPr>
-              <w:t xml:space="preserve">Alertes du tableau de bord</w:t>
-            </w:r>
-          </w:p>
-        </w:tc>
-        <w:tc>
-          <w:tcPr>
-            <w:tcW w:type="dxa" w:w="7627"/>
-            <w:tcBorders>
-              <w:top w:val="single" w:color="C9CFD8" w:sz="4"/>
-              <w:left w:val="single" w:color="C9CFD8" w:sz="4"/>
-              <w:bottom w:val="single" w:color="C9CFD8" w:sz="4"/>
-              <w:right w:val="single" w:color="C9CFD8" w:sz="4"/>
-            </w:tcBorders>
-            <w:tcMar>
-              <w:top w:type="dxa" w:w="50"/>
-              <w:left w:type="dxa" w:w="90"/>
-              <w:bottom w:type="dxa" w:w="50"/>
-              <w:right w:type="dxa" w:w="90"/>
-            </w:tcMar>
-            <w:vAlign w:val="center"/>
-          </w:tcPr>
-          <w:p>
-            <w:pPr>
-              <w:spacing w:after="0"/>
-            </w:pPr>
-            <w:r>
-              <w:rPr>
-                <w:rFonts w:ascii="Calibri" w:cs="Calibri" w:eastAsia="Calibri" w:hAnsi="Calibri"/>
-                <w:sz w:val="17"/>
-                <w:szCs w:val="17"/>
-              </w:rPr>
-              <w:t xml:space="preserve">marge transport &lt; 15 % ; créances échues depuis plus de 60 jours ; clôture mensuelle en retard de plus de 10 jours ; compte de passage 585 non soldé (bloquant) ; dépassement budgétaire &gt; 10 % ; validation en attente depuis plus de 3 jours ; trésorerie minimale et encours échu maximal à fixer</w:t>
+            <w:tcW w:type="dxa" w:w="3124"/>
+            <w:tcBorders>
+              <w:top w:val="single" w:color="C9CFD8" w:sz="4"/>
+              <w:left w:val="single" w:color="C9CFD8" w:sz="4"/>
+              <w:bottom w:val="single" w:color="C9CFD8" w:sz="4"/>
+              <w:right w:val="single" w:color="C9CFD8" w:sz="4"/>
+            </w:tcBorders>
+            <w:tcMar>
+              <w:top w:type="dxa" w:w="50"/>
+              <w:left w:type="dxa" w:w="90"/>
+              <w:bottom w:type="dxa" w:w="50"/>
+              <w:right w:type="dxa" w:w="90"/>
+            </w:tcMar>
+            <w:vAlign w:val="center"/>
+          </w:tcPr>
+          <w:p>
+            <w:pPr>
+              <w:spacing w:after="0"/>
+            </w:pPr>
+            <w:r>
+              <w:rPr>
+                <w:rFonts w:ascii="Calibri" w:cs="Calibri" w:eastAsia="Calibri" w:hAnsi="Calibri"/>
+                <w:sz w:val="17"/>
+                <w:szCs w:val="17"/>
+              </w:rPr>
+              <w:t xml:space="preserve">Approbation des règlements et décaissements</w:t>
+            </w:r>
+          </w:p>
+        </w:tc>
+        <w:tc>
+          <w:tcPr>
+            <w:tcW w:type="dxa" w:w="6514"/>
+            <w:tcBorders>
+              <w:top w:val="single" w:color="C9CFD8" w:sz="4"/>
+              <w:left w:val="single" w:color="C9CFD8" w:sz="4"/>
+              <w:bottom w:val="single" w:color="C9CFD8" w:sz="4"/>
+              <w:right w:val="single" w:color="C9CFD8" w:sz="4"/>
+            </w:tcBorders>
+            <w:tcMar>
+              <w:top w:type="dxa" w:w="50"/>
+              <w:left w:type="dxa" w:w="90"/>
+              <w:bottom w:type="dxa" w:w="50"/>
+              <w:right w:type="dxa" w:w="90"/>
+            </w:tcMar>
+            <w:vAlign w:val="center"/>
+          </w:tcPr>
+          <w:p>
+            <w:pPr>
+              <w:spacing w:after="0"/>
+            </w:pPr>
+            <w:r>
+              <w:rPr>
+                <w:rFonts w:ascii="Calibri" w:cs="Calibri" w:eastAsia="Calibri" w:hAnsi="Calibri"/>
+                <w:sz w:val="17"/>
+                <w:szCs w:val="17"/>
+              </w:rPr>
+              <w:t xml:space="preserve">règlements, sorties de caisse et de banque, échéances d'emprunt, virements internes : au-delà de 100 M GNF, accord de la direction ; l'opération reste en brouillon jusqu'à la dernière approbation</w:t>
             </w:r>
           </w:p>
         </w:tc>
@@ -2540,7 +2540,7 @@
       <w:tr>
         <w:tc>
           <w:tcPr>
-            <w:tcW w:type="dxa" w:w="2011"/>
+            <w:tcW w:type="dxa" w:w="3124"/>
             <w:tcBorders>
               <w:top w:val="single" w:color="C9CFD8" w:sz="4"/>
               <w:left w:val="single" w:color="C9CFD8" w:sz="4"/>
@@ -2566,13 +2566,13 @@
                 <w:sz w:val="17"/>
                 <w:szCs w:val="17"/>
               </w:rPr>
-              <w:t xml:space="preserve">Relances des clients</w:t>
-            </w:r>
-          </w:p>
-        </w:tc>
-        <w:tc>
-          <w:tcPr>
-            <w:tcW w:type="dxa" w:w="7627"/>
+              <w:t xml:space="preserve">Alertes de gestion (gravités bloquante, critique, élevée, moyenne, avec l'action recommandée)</w:t>
+            </w:r>
+          </w:p>
+        </w:tc>
+        <w:tc>
+          <w:tcPr>
+            <w:tcW w:type="dxa" w:w="6514"/>
             <w:tcBorders>
               <w:top w:val="single" w:color="C9CFD8" w:sz="4"/>
               <w:left w:val="single" w:color="C9CFD8" w:sz="4"/>
@@ -2598,7 +2598,7 @@
                 <w:sz w:val="17"/>
                 <w:szCs w:val="17"/>
               </w:rPr>
-              <w:t xml:space="preserve">rappel dès 1 jour de retard, relance ferme à 15 jours, mise en demeure à 30 jours (jamais envoyée sans décision de la finance)</w:t>
+              <w:t xml:space="preserve">compte de passage 585 non soldé (bloquant) ; trésorerie sous le minimum (à fixer par société) et compte de banque ou de caisse négatif ; DSCR &lt; 1,20 ; créances échues depuis plus de 90 jours, part échue &gt; 20 %, délai de recouvrement &gt; 60 jours, concentration sur un client &gt; 40 % ; dettes fournisseurs échues ; résultat net cumulé négatif ; marge transport &lt; 30 %, rotations non facturées, ensembles routiers déficitaires après charges de structure ; dépassement budgétaire &gt; 10 % ; clôture en retard de plus de 10 jours ; validation en attente depuis plus de 3 jours</w:t>
             </w:r>
           </w:p>
         </w:tc>
@@ -2606,63 +2606,63 @@
       <w:tr>
         <w:tc>
           <w:tcPr>
-            <w:tcW w:type="dxa" w:w="2011"/>
-            <w:tcBorders>
-              <w:top w:val="single" w:color="C9CFD8" w:sz="4"/>
-              <w:left w:val="single" w:color="C9CFD8" w:sz="4"/>
-              <w:bottom w:val="single" w:color="C9CFD8" w:sz="4"/>
-              <w:right w:val="single" w:color="C9CFD8" w:sz="4"/>
-            </w:tcBorders>
-            <w:tcMar>
-              <w:top w:type="dxa" w:w="50"/>
-              <w:left w:type="dxa" w:w="90"/>
-              <w:bottom w:type="dxa" w:w="50"/>
-              <w:right w:type="dxa" w:w="90"/>
-            </w:tcMar>
-            <w:vAlign w:val="center"/>
-          </w:tcPr>
-          <w:p>
-            <w:pPr>
-              <w:spacing w:after="0"/>
-            </w:pPr>
-            <w:r>
-              <w:rPr>
-                <w:rFonts w:ascii="Calibri" w:cs="Calibri" w:eastAsia="Calibri" w:hAnsi="Calibri"/>
-                <w:sz w:val="17"/>
-                <w:szCs w:val="17"/>
-              </w:rPr>
-              <w:t xml:space="preserve">Clôture mensuelle</w:t>
-            </w:r>
-          </w:p>
-        </w:tc>
-        <w:tc>
-          <w:tcPr>
-            <w:tcW w:type="dxa" w:w="7627"/>
-            <w:tcBorders>
-              <w:top w:val="single" w:color="C9CFD8" w:sz="4"/>
-              <w:left w:val="single" w:color="C9CFD8" w:sz="4"/>
-              <w:bottom w:val="single" w:color="C9CFD8" w:sz="4"/>
-              <w:right w:val="single" w:color="C9CFD8" w:sz="4"/>
-            </w:tcBorders>
-            <w:tcMar>
-              <w:top w:type="dxa" w:w="50"/>
-              <w:left w:type="dxa" w:w="90"/>
-              <w:bottom w:type="dxa" w:w="50"/>
-              <w:right w:type="dxa" w:w="90"/>
-            </w:tcMar>
-            <w:vAlign w:val="center"/>
-          </w:tcPr>
-          <w:p>
-            <w:pPr>
-              <w:spacing w:after="0"/>
-            </w:pPr>
-            <w:r>
-              <w:rPr>
-                <w:rFonts w:ascii="Calibri" w:cs="Calibri" w:eastAsia="Calibri" w:hAnsi="Calibri"/>
-                <w:sz w:val="17"/>
-                <w:szCs w:val="17"/>
-              </w:rPr>
-              <w:t xml:space="preserve">contrôles bloquants (équilibres, compte de passage, pièces en attente, relevés rapprochés), verrouillage et empreinte de chaînage des écritures, réouverture tracée</w:t>
+            <w:tcW w:type="dxa" w:w="3124"/>
+            <w:tcBorders>
+              <w:top w:val="single" w:color="C9CFD8" w:sz="4"/>
+              <w:left w:val="single" w:color="C9CFD8" w:sz="4"/>
+              <w:bottom w:val="single" w:color="C9CFD8" w:sz="4"/>
+              <w:right w:val="single" w:color="C9CFD8" w:sz="4"/>
+            </w:tcBorders>
+            <w:tcMar>
+              <w:top w:type="dxa" w:w="50"/>
+              <w:left w:type="dxa" w:w="90"/>
+              <w:bottom w:type="dxa" w:w="50"/>
+              <w:right w:type="dxa" w:w="90"/>
+            </w:tcMar>
+            <w:vAlign w:val="center"/>
+          </w:tcPr>
+          <w:p>
+            <w:pPr>
+              <w:spacing w:after="0"/>
+            </w:pPr>
+            <w:r>
+              <w:rPr>
+                <w:rFonts w:ascii="Calibri" w:cs="Calibri" w:eastAsia="Calibri" w:hAnsi="Calibri"/>
+                <w:sz w:val="17"/>
+                <w:szCs w:val="17"/>
+              </w:rPr>
+              <w:t xml:space="preserve">Pertes attendues (IFRS 9, retraitement hors livres SYSCOHADA)</w:t>
+            </w:r>
+          </w:p>
+        </w:tc>
+        <w:tc>
+          <w:tcPr>
+            <w:tcW w:type="dxa" w:w="6514"/>
+            <w:tcBorders>
+              <w:top w:val="single" w:color="C9CFD8" w:sz="4"/>
+              <w:left w:val="single" w:color="C9CFD8" w:sz="4"/>
+              <w:bottom w:val="single" w:color="C9CFD8" w:sz="4"/>
+              <w:right w:val="single" w:color="C9CFD8" w:sz="4"/>
+            </w:tcBorders>
+            <w:tcMar>
+              <w:top w:type="dxa" w:w="50"/>
+              <w:left w:type="dxa" w:w="90"/>
+              <w:bottom w:type="dxa" w:w="50"/>
+              <w:right w:type="dxa" w:w="90"/>
+            </w:tcMar>
+            <w:vAlign w:val="center"/>
+          </w:tcPr>
+          <w:p>
+            <w:pPr>
+              <w:spacing w:after="0"/>
+            </w:pPr>
+            <w:r>
+              <w:rPr>
+                <w:rFonts w:ascii="Calibri" w:cs="Calibri" w:eastAsia="Calibri" w:hAnsi="Calibri"/>
+                <w:sz w:val="17"/>
+                <w:szCs w:val="17"/>
+              </w:rPr>
+              <w:t xml:space="preserve">non échu 1 %, 1 à 30 jours 3 %, 31 à 60 jours 10 %, 61 à 90 jours 25 %, au-delà 50 %</w:t>
             </w:r>
           </w:p>
         </w:tc>
@@ -2670,7 +2670,7 @@
       <w:tr>
         <w:tc>
           <w:tcPr>
-            <w:tcW w:type="dxa" w:w="2011"/>
+            <w:tcW w:type="dxa" w:w="3124"/>
             <w:tcBorders>
               <w:top w:val="single" w:color="C9CFD8" w:sz="4"/>
               <w:left w:val="single" w:color="C9CFD8" w:sz="4"/>
@@ -2696,13 +2696,13 @@
                 <w:sz w:val="17"/>
                 <w:szCs w:val="17"/>
               </w:rPr>
-              <w:t xml:space="preserve">Transport</w:t>
-            </w:r>
-          </w:p>
-        </w:tc>
-        <w:tc>
-          <w:tcPr>
-            <w:tcW w:type="dxa" w:w="7627"/>
+              <w:t xml:space="preserve">Relances des clients</w:t>
+            </w:r>
+          </w:p>
+        </w:tc>
+        <w:tc>
+          <w:tcPr>
+            <w:tcW w:type="dxa" w:w="6514"/>
             <w:tcBorders>
               <w:top w:val="single" w:color="C9CFD8" w:sz="4"/>
               <w:left w:val="single" w:color="C9CFD8" w:sz="4"/>
@@ -2728,7 +2728,7 @@
                 <w:sz w:val="17"/>
                 <w:szCs w:val="17"/>
               </w:rPr>
-              <w:t xml:space="preserve">tarif du client sur la route, à défaut tarif de la route ; facture par client, une ligne par rotation</w:t>
+              <w:t xml:space="preserve">rappel dès 1 jour de retard, relance ferme à 15 jours, mise en demeure à 30 jours (jamais envoyée sans décision de la finance)</w:t>
             </w:r>
           </w:p>
         </w:tc>
@@ -2736,63 +2736,63 @@
       <w:tr>
         <w:tc>
           <w:tcPr>
-            <w:tcW w:type="dxa" w:w="2011"/>
-            <w:tcBorders>
-              <w:top w:val="single" w:color="C9CFD8" w:sz="4"/>
-              <w:left w:val="single" w:color="C9CFD8" w:sz="4"/>
-              <w:bottom w:val="single" w:color="C9CFD8" w:sz="4"/>
-              <w:right w:val="single" w:color="C9CFD8" w:sz="4"/>
-            </w:tcBorders>
-            <w:tcMar>
-              <w:top w:type="dxa" w:w="50"/>
-              <w:left w:type="dxa" w:w="90"/>
-              <w:bottom w:type="dxa" w:w="50"/>
-              <w:right w:type="dxa" w:w="90"/>
-            </w:tcMar>
-            <w:vAlign w:val="center"/>
-          </w:tcPr>
-          <w:p>
-            <w:pPr>
-              <w:spacing w:after="0"/>
-            </w:pPr>
-            <w:r>
-              <w:rPr>
-                <w:rFonts w:ascii="Calibri" w:cs="Calibri" w:eastAsia="Calibri" w:hAnsi="Calibri"/>
-                <w:sz w:val="17"/>
-                <w:szCs w:val="17"/>
-              </w:rPr>
-              <w:t xml:space="preserve">Chantiers</w:t>
-            </w:r>
-          </w:p>
-        </w:tc>
-        <w:tc>
-          <w:tcPr>
-            <w:tcW w:type="dxa" w:w="7627"/>
-            <w:tcBorders>
-              <w:top w:val="single" w:color="C9CFD8" w:sz="4"/>
-              <w:left w:val="single" w:color="C9CFD8" w:sz="4"/>
-              <w:bottom w:val="single" w:color="C9CFD8" w:sz="4"/>
-              <w:right w:val="single" w:color="C9CFD8" w:sz="4"/>
-            </w:tcBorders>
-            <w:tcMar>
-              <w:top w:type="dxa" w:w="50"/>
-              <w:left w:type="dxa" w:w="90"/>
-              <w:bottom w:type="dxa" w:w="50"/>
-              <w:right w:type="dxa" w:w="90"/>
-            </w:tcMar>
-            <w:vAlign w:val="center"/>
-          </w:tcPr>
-          <w:p>
-            <w:pPr>
-              <w:spacing w:after="0"/>
-            </w:pPr>
-            <w:r>
-              <w:rPr>
-                <w:rFonts w:ascii="Calibri" w:cs="Calibri" w:eastAsia="Calibri" w:hAnsi="Calibri"/>
-                <w:sz w:val="17"/>
-                <w:szCs w:val="17"/>
-              </w:rPr>
-              <w:t xml:space="preserve">retenue de garantie (5 % par défaut) portée en 4117 jusqu'à sa libération</w:t>
+            <w:tcW w:type="dxa" w:w="3124"/>
+            <w:tcBorders>
+              <w:top w:val="single" w:color="C9CFD8" w:sz="4"/>
+              <w:left w:val="single" w:color="C9CFD8" w:sz="4"/>
+              <w:bottom w:val="single" w:color="C9CFD8" w:sz="4"/>
+              <w:right w:val="single" w:color="C9CFD8" w:sz="4"/>
+            </w:tcBorders>
+            <w:tcMar>
+              <w:top w:type="dxa" w:w="50"/>
+              <w:left w:type="dxa" w:w="90"/>
+              <w:bottom w:type="dxa" w:w="50"/>
+              <w:right w:type="dxa" w:w="90"/>
+            </w:tcMar>
+            <w:vAlign w:val="center"/>
+          </w:tcPr>
+          <w:p>
+            <w:pPr>
+              <w:spacing w:after="0"/>
+            </w:pPr>
+            <w:r>
+              <w:rPr>
+                <w:rFonts w:ascii="Calibri" w:cs="Calibri" w:eastAsia="Calibri" w:hAnsi="Calibri"/>
+                <w:sz w:val="17"/>
+                <w:szCs w:val="17"/>
+              </w:rPr>
+              <w:t xml:space="preserve">Clôture mensuelle</w:t>
+            </w:r>
+          </w:p>
+        </w:tc>
+        <w:tc>
+          <w:tcPr>
+            <w:tcW w:type="dxa" w:w="6514"/>
+            <w:tcBorders>
+              <w:top w:val="single" w:color="C9CFD8" w:sz="4"/>
+              <w:left w:val="single" w:color="C9CFD8" w:sz="4"/>
+              <w:bottom w:val="single" w:color="C9CFD8" w:sz="4"/>
+              <w:right w:val="single" w:color="C9CFD8" w:sz="4"/>
+            </w:tcBorders>
+            <w:tcMar>
+              <w:top w:type="dxa" w:w="50"/>
+              <w:left w:type="dxa" w:w="90"/>
+              <w:bottom w:type="dxa" w:w="50"/>
+              <w:right w:type="dxa" w:w="90"/>
+            </w:tcMar>
+            <w:vAlign w:val="center"/>
+          </w:tcPr>
+          <w:p>
+            <w:pPr>
+              <w:spacing w:after="0"/>
+            </w:pPr>
+            <w:r>
+              <w:rPr>
+                <w:rFonts w:ascii="Calibri" w:cs="Calibri" w:eastAsia="Calibri" w:hAnsi="Calibri"/>
+                <w:sz w:val="17"/>
+                <w:szCs w:val="17"/>
+              </w:rPr>
+              <w:t xml:space="preserve">contrôles bloquants (équilibres, compte de passage, pièces en attente, relevés rapprochés), verrouillage et empreinte de chaînage des écritures, réouverture tracée</w:t>
             </w:r>
           </w:p>
         </w:tc>
@@ -2800,7 +2800,7 @@
       <w:tr>
         <w:tc>
           <w:tcPr>
-            <w:tcW w:type="dxa" w:w="2011"/>
+            <w:tcW w:type="dxa" w:w="3124"/>
             <w:tcBorders>
               <w:top w:val="single" w:color="C9CFD8" w:sz="4"/>
               <w:left w:val="single" w:color="C9CFD8" w:sz="4"/>
@@ -2826,13 +2826,13 @@
                 <w:sz w:val="17"/>
                 <w:szCs w:val="17"/>
               </w:rPr>
-              <w:t xml:space="preserve">Immobilier</w:t>
-            </w:r>
-          </w:p>
-        </w:tc>
-        <w:tc>
-          <w:tcPr>
-            <w:tcW w:type="dxa" w:w="7627"/>
+              <w:t xml:space="preserve">Transport</w:t>
+            </w:r>
+          </w:p>
+        </w:tc>
+        <w:tc>
+          <w:tcPr>
+            <w:tcW w:type="dxa" w:w="6514"/>
             <w:tcBorders>
               <w:top w:val="single" w:color="C9CFD8" w:sz="4"/>
               <w:left w:val="single" w:color="C9CFD8" w:sz="4"/>
@@ -2858,7 +2858,7 @@
                 <w:sz w:val="17"/>
                 <w:szCs w:val="17"/>
               </w:rPr>
-              <w:t xml:space="preserve">quittancement chaque nuit : une facture par échéance passée, datée de l'échéance, validée aussitôt (rattrapage compris) ; impayés relancés comme les autres créances</w:t>
+              <w:t xml:space="preserve">tarif du client sur la route, à défaut tarif de la route ; facture par client, une ligne par rotation</w:t>
             </w:r>
           </w:p>
         </w:tc>
@@ -2866,63 +2866,63 @@
       <w:tr>
         <w:tc>
           <w:tcPr>
-            <w:tcW w:type="dxa" w:w="2011"/>
-            <w:tcBorders>
-              <w:top w:val="single" w:color="C9CFD8" w:sz="4"/>
-              <w:left w:val="single" w:color="C9CFD8" w:sz="4"/>
-              <w:bottom w:val="single" w:color="C9CFD8" w:sz="4"/>
-              <w:right w:val="single" w:color="C9CFD8" w:sz="4"/>
-            </w:tcBorders>
-            <w:tcMar>
-              <w:top w:type="dxa" w:w="50"/>
-              <w:left w:type="dxa" w:w="90"/>
-              <w:bottom w:type="dxa" w:w="50"/>
-              <w:right w:type="dxa" w:w="90"/>
-            </w:tcMar>
-            <w:vAlign w:val="center"/>
-          </w:tcPr>
-          <w:p>
-            <w:pPr>
-              <w:spacing w:after="0"/>
-            </w:pPr>
-            <w:r>
-              <w:rPr>
-                <w:rFonts w:ascii="Calibri" w:cs="Calibri" w:eastAsia="Calibri" w:hAnsi="Calibri"/>
-                <w:sz w:val="17"/>
-                <w:szCs w:val="17"/>
-              </w:rPr>
-              <w:t xml:space="preserve">Pièces déposées</w:t>
-            </w:r>
-          </w:p>
-        </w:tc>
-        <w:tc>
-          <w:tcPr>
-            <w:tcW w:type="dxa" w:w="7627"/>
-            <w:tcBorders>
-              <w:top w:val="single" w:color="C9CFD8" w:sz="4"/>
-              <w:left w:val="single" w:color="C9CFD8" w:sz="4"/>
-              <w:bottom w:val="single" w:color="C9CFD8" w:sz="4"/>
-              <w:right w:val="single" w:color="C9CFD8" w:sz="4"/>
-            </w:tcBorders>
-            <w:tcMar>
-              <w:top w:type="dxa" w:w="50"/>
-              <w:left w:type="dxa" w:w="90"/>
-              <w:bottom w:type="dxa" w:w="50"/>
-              <w:right w:type="dxa" w:w="90"/>
-            </w:tcMar>
-            <w:vAlign w:val="center"/>
-          </w:tcPr>
-          <w:p>
-            <w:pPr>
-              <w:spacing w:after="0"/>
-            </w:pPr>
-            <w:r>
-              <w:rPr>
-                <w:rFonts w:ascii="Calibri" w:cs="Calibri" w:eastAsia="Calibri" w:hAnsi="Calibri"/>
-                <w:sz w:val="17"/>
-                <w:szCs w:val="17"/>
-              </w:rPr>
-              <w:t xml:space="preserve">PDF, JPEG, PNG, Word .docx et Excel .xlsx, reconnus d'après leur contenu ; 20 Mo par fichier ; dossier d'un porteur limité à 400 pièces ou 1 Go, 50 messages par jour</w:t>
+            <w:tcW w:type="dxa" w:w="3124"/>
+            <w:tcBorders>
+              <w:top w:val="single" w:color="C9CFD8" w:sz="4"/>
+              <w:left w:val="single" w:color="C9CFD8" w:sz="4"/>
+              <w:bottom w:val="single" w:color="C9CFD8" w:sz="4"/>
+              <w:right w:val="single" w:color="C9CFD8" w:sz="4"/>
+            </w:tcBorders>
+            <w:tcMar>
+              <w:top w:type="dxa" w:w="50"/>
+              <w:left w:type="dxa" w:w="90"/>
+              <w:bottom w:type="dxa" w:w="50"/>
+              <w:right w:type="dxa" w:w="90"/>
+            </w:tcMar>
+            <w:vAlign w:val="center"/>
+          </w:tcPr>
+          <w:p>
+            <w:pPr>
+              <w:spacing w:after="0"/>
+            </w:pPr>
+            <w:r>
+              <w:rPr>
+                <w:rFonts w:ascii="Calibri" w:cs="Calibri" w:eastAsia="Calibri" w:hAnsi="Calibri"/>
+                <w:sz w:val="17"/>
+                <w:szCs w:val="17"/>
+              </w:rPr>
+              <w:t xml:space="preserve">Chantiers</w:t>
+            </w:r>
+          </w:p>
+        </w:tc>
+        <w:tc>
+          <w:tcPr>
+            <w:tcW w:type="dxa" w:w="6514"/>
+            <w:tcBorders>
+              <w:top w:val="single" w:color="C9CFD8" w:sz="4"/>
+              <w:left w:val="single" w:color="C9CFD8" w:sz="4"/>
+              <w:bottom w:val="single" w:color="C9CFD8" w:sz="4"/>
+              <w:right w:val="single" w:color="C9CFD8" w:sz="4"/>
+            </w:tcBorders>
+            <w:tcMar>
+              <w:top w:type="dxa" w:w="50"/>
+              <w:left w:type="dxa" w:w="90"/>
+              <w:bottom w:type="dxa" w:w="50"/>
+              <w:right w:type="dxa" w:w="90"/>
+            </w:tcMar>
+            <w:vAlign w:val="center"/>
+          </w:tcPr>
+          <w:p>
+            <w:pPr>
+              <w:spacing w:after="0"/>
+            </w:pPr>
+            <w:r>
+              <w:rPr>
+                <w:rFonts w:ascii="Calibri" w:cs="Calibri" w:eastAsia="Calibri" w:hAnsi="Calibri"/>
+                <w:sz w:val="17"/>
+                <w:szCs w:val="17"/>
+              </w:rPr>
+              <w:t xml:space="preserve">retenue de garantie (5 % par défaut) portée en 4117 jusqu'à sa libération</w:t>
             </w:r>
           </w:p>
         </w:tc>
@@ -2930,7 +2930,7 @@
       <w:tr>
         <w:tc>
           <w:tcPr>
-            <w:tcW w:type="dxa" w:w="2011"/>
+            <w:tcW w:type="dxa" w:w="3124"/>
             <w:tcBorders>
               <w:top w:val="single" w:color="C9CFD8" w:sz="4"/>
               <w:left w:val="single" w:color="C9CFD8" w:sz="4"/>
@@ -2956,13 +2956,13 @@
                 <w:sz w:val="17"/>
                 <w:szCs w:val="17"/>
               </w:rPr>
-              <w:t xml:space="preserve">AxisPro</w:t>
-            </w:r>
-          </w:p>
-        </w:tc>
-        <w:tc>
-          <w:tcPr>
-            <w:tcW w:type="dxa" w:w="7627"/>
+              <w:t xml:space="preserve">Immobilier</w:t>
+            </w:r>
+          </w:p>
+        </w:tc>
+        <w:tc>
+          <w:tcPr>
+            <w:tcW w:type="dxa" w:w="6514"/>
             <w:tcBorders>
               <w:top w:val="single" w:color="C9CFD8" w:sz="4"/>
               <w:left w:val="single" w:color="C9CFD8" w:sz="4"/>
@@ -2988,7 +2988,137 @@
                 <w:sz w:val="17"/>
                 <w:szCs w:val="17"/>
               </w:rPr>
-              <w:t xml:space="preserve">score par domaine pondéré ; éliminatoire non satisfait : NO-GO ; GO à partir de 70/100 sans critère critique ouvert ; conditionnel à partir de 50/100 ; preuve exigée pour les critères qui le demandent</w:t>
+              <w:t xml:space="preserve">quittancement chaque nuit : une facture par échéance passée, datée de l'échéance, validée aussitôt (rattrapage compris) ; impayés relancés comme les autres créances</w:t>
+            </w:r>
+          </w:p>
+        </w:tc>
+      </w:tr>
+      <w:tr>
+        <w:tc>
+          <w:tcPr>
+            <w:tcW w:type="dxa" w:w="3124"/>
+            <w:tcBorders>
+              <w:top w:val="single" w:color="C9CFD8" w:sz="4"/>
+              <w:left w:val="single" w:color="C9CFD8" w:sz="4"/>
+              <w:bottom w:val="single" w:color="C9CFD8" w:sz="4"/>
+              <w:right w:val="single" w:color="C9CFD8" w:sz="4"/>
+            </w:tcBorders>
+            <w:tcMar>
+              <w:top w:type="dxa" w:w="50"/>
+              <w:left w:type="dxa" w:w="90"/>
+              <w:bottom w:type="dxa" w:w="50"/>
+              <w:right w:type="dxa" w:w="90"/>
+            </w:tcMar>
+            <w:vAlign w:val="center"/>
+          </w:tcPr>
+          <w:p>
+            <w:pPr>
+              <w:spacing w:after="0"/>
+            </w:pPr>
+            <w:r>
+              <w:rPr>
+                <w:rFonts w:ascii="Calibri" w:cs="Calibri" w:eastAsia="Calibri" w:hAnsi="Calibri"/>
+                <w:sz w:val="17"/>
+                <w:szCs w:val="17"/>
+              </w:rPr>
+              <w:t xml:space="preserve">Pièces déposées</w:t>
+            </w:r>
+          </w:p>
+        </w:tc>
+        <w:tc>
+          <w:tcPr>
+            <w:tcW w:type="dxa" w:w="6514"/>
+            <w:tcBorders>
+              <w:top w:val="single" w:color="C9CFD8" w:sz="4"/>
+              <w:left w:val="single" w:color="C9CFD8" w:sz="4"/>
+              <w:bottom w:val="single" w:color="C9CFD8" w:sz="4"/>
+              <w:right w:val="single" w:color="C9CFD8" w:sz="4"/>
+            </w:tcBorders>
+            <w:tcMar>
+              <w:top w:type="dxa" w:w="50"/>
+              <w:left w:type="dxa" w:w="90"/>
+              <w:bottom w:type="dxa" w:w="50"/>
+              <w:right w:type="dxa" w:w="90"/>
+            </w:tcMar>
+            <w:vAlign w:val="center"/>
+          </w:tcPr>
+          <w:p>
+            <w:pPr>
+              <w:spacing w:after="0"/>
+            </w:pPr>
+            <w:r>
+              <w:rPr>
+                <w:rFonts w:ascii="Calibri" w:cs="Calibri" w:eastAsia="Calibri" w:hAnsi="Calibri"/>
+                <w:sz w:val="17"/>
+                <w:szCs w:val="17"/>
+              </w:rPr>
+              <w:t xml:space="preserve">PDF, JPEG, PNG, Word .docx et Excel .xlsx, reconnus d'après leur contenu ; 20 Mo par fichier ; dossier d'un porteur limité à 400 pièces ou 1 Go, 50 messages par jour</w:t>
+            </w:r>
+          </w:p>
+        </w:tc>
+      </w:tr>
+      <w:tr>
+        <w:tc>
+          <w:tcPr>
+            <w:tcW w:type="dxa" w:w="3124"/>
+            <w:tcBorders>
+              <w:top w:val="single" w:color="C9CFD8" w:sz="4"/>
+              <w:left w:val="single" w:color="C9CFD8" w:sz="4"/>
+              <w:bottom w:val="single" w:color="C9CFD8" w:sz="4"/>
+              <w:right w:val="single" w:color="C9CFD8" w:sz="4"/>
+            </w:tcBorders>
+            <w:shd w:fill="F2F4F7" w:color="auto" w:val="clear"/>
+            <w:tcMar>
+              <w:top w:type="dxa" w:w="50"/>
+              <w:left w:type="dxa" w:w="90"/>
+              <w:bottom w:type="dxa" w:w="50"/>
+              <w:right w:type="dxa" w:w="90"/>
+            </w:tcMar>
+            <w:vAlign w:val="center"/>
+          </w:tcPr>
+          <w:p>
+            <w:pPr>
+              <w:spacing w:after="0"/>
+            </w:pPr>
+            <w:r>
+              <w:rPr>
+                <w:rFonts w:ascii="Calibri" w:cs="Calibri" w:eastAsia="Calibri" w:hAnsi="Calibri"/>
+                <w:sz w:val="17"/>
+                <w:szCs w:val="17"/>
+              </w:rPr>
+              <w:t xml:space="preserve">AxisPro (méthode MB AxisPro, réf. SC-01)</w:t>
+            </w:r>
+          </w:p>
+        </w:tc>
+        <w:tc>
+          <w:tcPr>
+            <w:tcW w:type="dxa" w:w="6514"/>
+            <w:tcBorders>
+              <w:top w:val="single" w:color="C9CFD8" w:sz="4"/>
+              <w:left w:val="single" w:color="C9CFD8" w:sz="4"/>
+              <w:bottom w:val="single" w:color="C9CFD8" w:sz="4"/>
+              <w:right w:val="single" w:color="C9CFD8" w:sz="4"/>
+            </w:tcBorders>
+            <w:shd w:fill="F2F4F7" w:color="auto" w:val="clear"/>
+            <w:tcMar>
+              <w:top w:type="dxa" w:w="50"/>
+              <w:left w:type="dxa" w:w="90"/>
+              <w:bottom w:type="dxa" w:w="50"/>
+              <w:right w:type="dxa" w:w="90"/>
+            </w:tcMar>
+            <w:vAlign w:val="center"/>
+          </w:tcPr>
+          <w:p>
+            <w:pPr>
+              <w:spacing w:after="0"/>
+            </w:pPr>
+            <w:r>
+              <w:rPr>
+                <w:rFonts w:ascii="Calibri" w:cs="Calibri" w:eastAsia="Calibri" w:hAnsi="Calibri"/>
+                <w:sz w:val="17"/>
+                <w:szCs w:val="17"/>
+              </w:rPr>
+              <w:t xml:space="preserve">grille officielle de 111 critères, 15 domaines, 8 gates ; atteint 1, partiel 0,5, non disponible 0, non évalué compté non disponible ; preuve exigée ou périmée : critère ramené à partiel ; scores Project Readiness, APD Readiness et Bankability ; knock-out non atteint (ou incomplet) : NO-GO ; BANKABLE à partir de 80/100, APD READY à partir de 65, CONDITIONAL GO à partir de 50, HOLD à partir de 30 ; décision du comité scellée, dossier figé jusqu'à une nouvelle révision</w:t>
             </w:r>
           </w:p>
         </w:tc>
@@ -3232,7 +3362,7 @@
           <w:sz w:val="20"/>
           <w:szCs w:val="20"/>
         </w:rPr>
-        <w:t xml:space="preserve">Fichiers simples remplis à partir du classeur 2026 : tiers, soldes d'ouverture (journal des à-nouveaux), écritures de l'exercice pièce par pièce (ventes, achats, trésorerie, OD) avec lettrage des comptes de tiers, budget mensuel, rotations. Chaque chargement est d'abord contrôlé (aucune écriture en cas d'anomalie), rejoué autant que nécessaire en recette, puis appliqué en production. Les relevés bancaires 2026 se chargent par l'écran Trésorerie ; immobilisations et emprunts se saisissent dans leurs écrans. Les balances obtenues sont confrontées au classeur et validées par le responsable financier avant la mise en production (offre, chapitre 6.3).</w:t>
+        <w:t xml:space="preserve">Fichiers simples remplis à partir du classeur 2026 : tiers, soldes d'ouverture (journal des à-nouveaux), écritures de l'exercice pièce par pièce (ventes, achats, trésorerie, OD) avec lettrage des comptes de tiers, budget mensuel, rotations. Chaque chargement est d'abord contrôlé (aucune écriture en cas d'anomalie), rejoué autant que nécessaire en recette, puis appliqué en production. Les relevés bancaires 2026 se chargent par l'écran Trésorerie ; immobilisations et emprunts se saisissent dans leurs écrans. Les balances obtenues sont confrontées au classeur et validées par le responsable financier avant la mise en production (offre, chapitre 6.3) : les 26 valeurs de référence du classeur (équilibre, résultat, trésorerie, créances, dettes, transport, bilan) sont recalculées par la plateforme et leur conformité (« n/26 ») est annexée au procès-verbal de bascule.</w:t>
       </w:r>
     </w:p>
     <w:p>
@@ -3268,10 +3398,10 @@
         </w:tblBorders>
       </w:tblPr>
       <w:tblGrid>
-        <w:gridCol w:w="708"/>
-        <w:gridCol w:w="2415"/>
-        <w:gridCol w:w="1724"/>
-        <w:gridCol w:w="4792"/>
+        <w:gridCol w:w="650"/>
+        <w:gridCol w:w="2216"/>
+        <w:gridCol w:w="1899"/>
+        <w:gridCol w:w="4873"/>
       </w:tblGrid>
       <w:tr>
         <w:trPr>
@@ -3279,7 +3409,7 @@
         </w:trPr>
         <w:tc>
           <w:tcPr>
-            <w:tcW w:type="dxa" w:w="708"/>
+            <w:tcW w:type="dxa" w:w="650"/>
             <w:tcBorders>
               <w:top w:val="single" w:color="C9CFD8" w:sz="4"/>
               <w:left w:val="single" w:color="C9CFD8" w:sz="4"/>
@@ -3314,7 +3444,7 @@
         </w:tc>
         <w:tc>
           <w:tcPr>
-            <w:tcW w:type="dxa" w:w="2415"/>
+            <w:tcW w:type="dxa" w:w="2216"/>
             <w:tcBorders>
               <w:top w:val="single" w:color="C9CFD8" w:sz="4"/>
               <w:left w:val="single" w:color="C9CFD8" w:sz="4"/>
@@ -3349,7 +3479,7 @@
         </w:tc>
         <w:tc>
           <w:tcPr>
-            <w:tcW w:type="dxa" w:w="1724"/>
+            <w:tcW w:type="dxa" w:w="1899"/>
             <w:tcBorders>
               <w:top w:val="single" w:color="C9CFD8" w:sz="4"/>
               <w:left w:val="single" w:color="C9CFD8" w:sz="4"/>
@@ -3384,7 +3514,7 @@
         </w:tc>
         <w:tc>
           <w:tcPr>
-            <w:tcW w:type="dxa" w:w="4792"/>
+            <w:tcW w:type="dxa" w:w="4873"/>
             <w:tcBorders>
               <w:top w:val="single" w:color="C9CFD8" w:sz="4"/>
               <w:left w:val="single" w:color="C9CFD8" w:sz="4"/>
@@ -3421,7 +3551,7 @@
       <w:tr>
         <w:tc>
           <w:tcPr>
-            <w:tcW w:type="dxa" w:w="708"/>
+            <w:tcW w:type="dxa" w:w="650"/>
             <w:tcBorders>
               <w:top w:val="single" w:color="C9CFD8" w:sz="4"/>
               <w:left w:val="single" w:color="C9CFD8" w:sz="4"/>
@@ -3452,7 +3582,7 @@
         </w:tc>
         <w:tc>
           <w:tcPr>
-            <w:tcW w:type="dxa" w:w="2415"/>
+            <w:tcW w:type="dxa" w:w="2216"/>
             <w:tcBorders>
               <w:top w:val="single" w:color="C9CFD8" w:sz="4"/>
               <w:left w:val="single" w:color="C9CFD8" w:sz="4"/>
@@ -3483,63 +3613,63 @@
         </w:tc>
         <w:tc>
           <w:tcPr>
-            <w:tcW w:type="dxa" w:w="1724"/>
-            <w:tcBorders>
-              <w:top w:val="single" w:color="C9CFD8" w:sz="4"/>
-              <w:left w:val="single" w:color="C9CFD8" w:sz="4"/>
-              <w:bottom w:val="single" w:color="C9CFD8" w:sz="4"/>
-              <w:right w:val="single" w:color="C9CFD8" w:sz="4"/>
-            </w:tcBorders>
-            <w:tcMar>
-              <w:top w:type="dxa" w:w="50"/>
-              <w:left w:type="dxa" w:w="90"/>
-              <w:bottom w:type="dxa" w:w="50"/>
-              <w:right w:type="dxa" w:w="90"/>
-            </w:tcMar>
-            <w:vAlign w:val="center"/>
-          </w:tcPr>
-          <w:p>
-            <w:pPr>
-              <w:spacing w:after="0"/>
-            </w:pPr>
-            <w:r>
-              <w:rPr>
-                <w:rFonts w:ascii="Calibri" w:cs="Calibri" w:eastAsia="Calibri" w:hAnsi="Calibri"/>
-                <w:sz w:val="17"/>
-                <w:szCs w:val="17"/>
-              </w:rPr>
-              <w:t xml:space="preserve">Tableau de bord, Rapport mensuel</w:t>
-            </w:r>
-          </w:p>
-        </w:tc>
-        <w:tc>
-          <w:tcPr>
-            <w:tcW w:type="dxa" w:w="4792"/>
-            <w:tcBorders>
-              <w:top w:val="single" w:color="C9CFD8" w:sz="4"/>
-              <w:left w:val="single" w:color="C9CFD8" w:sz="4"/>
-              <w:bottom w:val="single" w:color="C9CFD8" w:sz="4"/>
-              <w:right w:val="single" w:color="C9CFD8" w:sz="4"/>
-            </w:tcBorders>
-            <w:tcMar>
-              <w:top w:type="dxa" w:w="50"/>
-              <w:left w:type="dxa" w:w="90"/>
-              <w:bottom w:type="dxa" w:w="50"/>
-              <w:right w:type="dxa" w:w="90"/>
-            </w:tcMar>
-            <w:vAlign w:val="center"/>
-          </w:tcPr>
-          <w:p>
-            <w:pPr>
-              <w:spacing w:after="0"/>
-            </w:pPr>
-            <w:r>
-              <w:rPr>
-                <w:rFonts w:ascii="Calibri" w:cs="Calibri" w:eastAsia="Calibri" w:hAnsi="Calibri"/>
-                <w:sz w:val="17"/>
-                <w:szCs w:val="17"/>
-              </w:rPr>
-              <w:t xml:space="preserve">Saisir une facture : CA et encours à jour immédiatement</w:t>
+            <w:tcW w:type="dxa" w:w="1899"/>
+            <w:tcBorders>
+              <w:top w:val="single" w:color="C9CFD8" w:sz="4"/>
+              <w:left w:val="single" w:color="C9CFD8" w:sz="4"/>
+              <w:bottom w:val="single" w:color="C9CFD8" w:sz="4"/>
+              <w:right w:val="single" w:color="C9CFD8" w:sz="4"/>
+            </w:tcBorders>
+            <w:tcMar>
+              <w:top w:type="dxa" w:w="50"/>
+              <w:left w:type="dxa" w:w="90"/>
+              <w:bottom w:type="dxa" w:w="50"/>
+              <w:right w:type="dxa" w:w="90"/>
+            </w:tcMar>
+            <w:vAlign w:val="center"/>
+          </w:tcPr>
+          <w:p>
+            <w:pPr>
+              <w:spacing w:after="0"/>
+            </w:pPr>
+            <w:r>
+              <w:rPr>
+                <w:rFonts w:ascii="Calibri" w:cs="Calibri" w:eastAsia="Calibri" w:hAnsi="Calibri"/>
+                <w:sz w:val="17"/>
+                <w:szCs w:val="17"/>
+              </w:rPr>
+              <w:t xml:space="preserve">Tableau de bord, Pilotage, Rapport mensuel</w:t>
+            </w:r>
+          </w:p>
+        </w:tc>
+        <w:tc>
+          <w:tcPr>
+            <w:tcW w:type="dxa" w:w="4873"/>
+            <w:tcBorders>
+              <w:top w:val="single" w:color="C9CFD8" w:sz="4"/>
+              <w:left w:val="single" w:color="C9CFD8" w:sz="4"/>
+              <w:bottom w:val="single" w:color="C9CFD8" w:sz="4"/>
+              <w:right w:val="single" w:color="C9CFD8" w:sz="4"/>
+            </w:tcBorders>
+            <w:tcMar>
+              <w:top w:type="dxa" w:w="50"/>
+              <w:left w:type="dxa" w:w="90"/>
+              <w:bottom w:type="dxa" w:w="50"/>
+              <w:right w:type="dxa" w:w="90"/>
+            </w:tcMar>
+            <w:vAlign w:val="center"/>
+          </w:tcPr>
+          <w:p>
+            <w:pPr>
+              <w:spacing w:after="0"/>
+            </w:pPr>
+            <w:r>
+              <w:rPr>
+                <w:rFonts w:ascii="Calibri" w:cs="Calibri" w:eastAsia="Calibri" w:hAnsi="Calibri"/>
+                <w:sz w:val="17"/>
+                <w:szCs w:val="17"/>
+              </w:rPr>
+              <w:t xml:space="preserve">Saisir une facture : CA et encours à jour immédiatement ; onze questions du dirigeant avec leur verdict ; « ce qui demande une décision » ; arrêté à une date</w:t>
             </w:r>
           </w:p>
         </w:tc>
@@ -3547,7 +3677,7 @@
       <w:tr>
         <w:tc>
           <w:tcPr>
-            <w:tcW w:type="dxa" w:w="708"/>
+            <w:tcW w:type="dxa" w:w="650"/>
             <w:tcBorders>
               <w:top w:val="single" w:color="C9CFD8" w:sz="4"/>
               <w:left w:val="single" w:color="C9CFD8" w:sz="4"/>
@@ -3579,7 +3709,7 @@
         </w:tc>
         <w:tc>
           <w:tcPr>
-            <w:tcW w:type="dxa" w:w="2415"/>
+            <w:tcW w:type="dxa" w:w="2216"/>
             <w:tcBorders>
               <w:top w:val="single" w:color="C9CFD8" w:sz="4"/>
               <w:left w:val="single" w:color="C9CFD8" w:sz="4"/>
@@ -3611,7 +3741,7 @@
         </w:tc>
         <w:tc>
           <w:tcPr>
-            <w:tcW w:type="dxa" w:w="1724"/>
+            <w:tcW w:type="dxa" w:w="1899"/>
             <w:tcBorders>
               <w:top w:val="single" w:color="C9CFD8" w:sz="4"/>
               <w:left w:val="single" w:color="C9CFD8" w:sz="4"/>
@@ -3637,13 +3767,13 @@
                 <w:sz w:val="17"/>
                 <w:szCs w:val="17"/>
               </w:rPr>
-              <w:t xml:space="preserve">Sélecteur de société, bouton Groupe ; Activités et budget</w:t>
-            </w:r>
-          </w:p>
-        </w:tc>
-        <w:tc>
-          <w:tcPr>
-            <w:tcW w:type="dxa" w:w="4792"/>
+              <w:t xml:space="preserve">Sélecteur de société, bouton Groupe ; États &gt; Consolidé du groupe ; Activités et budget</w:t>
+            </w:r>
+          </w:p>
+        </w:tc>
+        <w:tc>
+          <w:tcPr>
+            <w:tcW w:type="dxa" w:w="4873"/>
             <w:tcBorders>
               <w:top w:val="single" w:color="C9CFD8" w:sz="4"/>
               <w:left w:val="single" w:color="C9CFD8" w:sz="4"/>
@@ -3669,7 +3799,7 @@
                 <w:sz w:val="17"/>
                 <w:szCs w:val="17"/>
               </w:rPr>
-              <w:t xml:space="preserve">Un même compte passe d'une société à l'autre, comptabilités séparées ; vue groupe ; marge par activité, chantier, ensemble, route</w:t>
+              <w:t xml:space="preserve">Un même compte passe d'une société à l'autre, comptabilités séparées ; compte de résultat et bilan par société, éliminations intra-groupe, groupe ; marge par activité, centre de coût, chantier, ensemble, route</w:t>
             </w:r>
           </w:p>
         </w:tc>
@@ -3677,7 +3807,7 @@
       <w:tr>
         <w:tc>
           <w:tcPr>
-            <w:tcW w:type="dxa" w:w="708"/>
+            <w:tcW w:type="dxa" w:w="650"/>
             <w:tcBorders>
               <w:top w:val="single" w:color="C9CFD8" w:sz="4"/>
               <w:left w:val="single" w:color="C9CFD8" w:sz="4"/>
@@ -3708,7 +3838,7 @@
         </w:tc>
         <w:tc>
           <w:tcPr>
-            <w:tcW w:type="dxa" w:w="2415"/>
+            <w:tcW w:type="dxa" w:w="2216"/>
             <w:tcBorders>
               <w:top w:val="single" w:color="C9CFD8" w:sz="4"/>
               <w:left w:val="single" w:color="C9CFD8" w:sz="4"/>
@@ -3739,63 +3869,63 @@
         </w:tc>
         <w:tc>
           <w:tcPr>
-            <w:tcW w:type="dxa" w:w="1724"/>
-            <w:tcBorders>
-              <w:top w:val="single" w:color="C9CFD8" w:sz="4"/>
-              <w:left w:val="single" w:color="C9CFD8" w:sz="4"/>
-              <w:bottom w:val="single" w:color="C9CFD8" w:sz="4"/>
-              <w:right w:val="single" w:color="C9CFD8" w:sz="4"/>
-            </w:tcBorders>
-            <w:tcMar>
-              <w:top w:type="dxa" w:w="50"/>
-              <w:left w:type="dxa" w:w="90"/>
-              <w:bottom w:type="dxa" w:w="50"/>
-              <w:right w:type="dxa" w:w="90"/>
-            </w:tcMar>
-            <w:vAlign w:val="center"/>
-          </w:tcPr>
-          <w:p>
-            <w:pPr>
-              <w:spacing w:after="0"/>
-            </w:pPr>
-            <w:r>
-              <w:rPr>
-                <w:rFonts w:ascii="Calibri" w:cs="Calibri" w:eastAsia="Calibri" w:hAnsi="Calibri"/>
-                <w:sz w:val="17"/>
-                <w:szCs w:val="17"/>
-              </w:rPr>
-              <w:t xml:space="preserve">Balance et états</w:t>
-            </w:r>
-          </w:p>
-        </w:tc>
-        <w:tc>
-          <w:tcPr>
-            <w:tcW w:type="dxa" w:w="4792"/>
-            <w:tcBorders>
-              <w:top w:val="single" w:color="C9CFD8" w:sz="4"/>
-              <w:left w:val="single" w:color="C9CFD8" w:sz="4"/>
-              <w:bottom w:val="single" w:color="C9CFD8" w:sz="4"/>
-              <w:right w:val="single" w:color="C9CFD8" w:sz="4"/>
-            </w:tcBorders>
-            <w:tcMar>
-              <w:top w:type="dxa" w:w="50"/>
-              <w:left w:type="dxa" w:w="90"/>
-              <w:bottom w:type="dxa" w:w="50"/>
-              <w:right w:type="dxa" w:w="90"/>
-            </w:tcMar>
-            <w:vAlign w:val="center"/>
-          </w:tcPr>
-          <w:p>
-            <w:pPr>
-              <w:spacing w:after="0"/>
-            </w:pPr>
-            <w:r>
-              <w:rPr>
-                <w:rFonts w:ascii="Calibri" w:cs="Calibri" w:eastAsia="Calibri" w:hAnsi="Calibri"/>
-                <w:sz w:val="17"/>
-                <w:szCs w:val="17"/>
-              </w:rPr>
-              <w:t xml:space="preserve">Bilan équilibré, compte de résultat, tableau des flux rapproché de la trésorerie</w:t>
+            <w:tcW w:type="dxa" w:w="1899"/>
+            <w:tcBorders>
+              <w:top w:val="single" w:color="C9CFD8" w:sz="4"/>
+              <w:left w:val="single" w:color="C9CFD8" w:sz="4"/>
+              <w:bottom w:val="single" w:color="C9CFD8" w:sz="4"/>
+              <w:right w:val="single" w:color="C9CFD8" w:sz="4"/>
+            </w:tcBorders>
+            <w:tcMar>
+              <w:top w:type="dxa" w:w="50"/>
+              <w:left w:type="dxa" w:w="90"/>
+              <w:bottom w:type="dxa" w:w="50"/>
+              <w:right w:type="dxa" w:w="90"/>
+            </w:tcMar>
+            <w:vAlign w:val="center"/>
+          </w:tcPr>
+          <w:p>
+            <w:pPr>
+              <w:spacing w:after="0"/>
+            </w:pPr>
+            <w:r>
+              <w:rPr>
+                <w:rFonts w:ascii="Calibri" w:cs="Calibri" w:eastAsia="Calibri" w:hAnsi="Calibri"/>
+                <w:sz w:val="17"/>
+                <w:szCs w:val="17"/>
+              </w:rPr>
+              <w:t xml:space="preserve">Balance et états, Clôtures</w:t>
+            </w:r>
+          </w:p>
+        </w:tc>
+        <w:tc>
+          <w:tcPr>
+            <w:tcW w:type="dxa" w:w="4873"/>
+            <w:tcBorders>
+              <w:top w:val="single" w:color="C9CFD8" w:sz="4"/>
+              <w:left w:val="single" w:color="C9CFD8" w:sz="4"/>
+              <w:bottom w:val="single" w:color="C9CFD8" w:sz="4"/>
+              <w:right w:val="single" w:color="C9CFD8" w:sz="4"/>
+            </w:tcBorders>
+            <w:tcMar>
+              <w:top w:type="dxa" w:w="50"/>
+              <w:left w:type="dxa" w:w="90"/>
+              <w:bottom w:type="dxa" w:w="50"/>
+              <w:right w:type="dxa" w:w="90"/>
+            </w:tcMar>
+            <w:vAlign w:val="center"/>
+          </w:tcPr>
+          <w:p>
+            <w:pPr>
+              <w:spacing w:after="0"/>
+            </w:pPr>
+            <w:r>
+              <w:rPr>
+                <w:rFonts w:ascii="Calibri" w:cs="Calibri" w:eastAsia="Calibri" w:hAnsi="Calibri"/>
+                <w:sz w:val="17"/>
+                <w:szCs w:val="17"/>
+              </w:rPr>
+              <w:t xml:space="preserve">Bilan équilibré, compte de résultat, tableau des flux rapproché de la trésorerie ; clôture mensuelle complète (dotations, liquidation de la TVA, factures à établir, sceau et procès-verbal) ; exports XLSX et CSV des états ; SAF-T</w:t>
             </w:r>
           </w:p>
         </w:tc>
@@ -3803,7 +3933,7 @@
       <w:tr>
         <w:tc>
           <w:tcPr>
-            <w:tcW w:type="dxa" w:w="708"/>
+            <w:tcW w:type="dxa" w:w="650"/>
             <w:tcBorders>
               <w:top w:val="single" w:color="C9CFD8" w:sz="4"/>
               <w:left w:val="single" w:color="C9CFD8" w:sz="4"/>
@@ -3835,7 +3965,7 @@
         </w:tc>
         <w:tc>
           <w:tcPr>
-            <w:tcW w:type="dxa" w:w="2415"/>
+            <w:tcW w:type="dxa" w:w="2216"/>
             <w:tcBorders>
               <w:top w:val="single" w:color="C9CFD8" w:sz="4"/>
               <w:left w:val="single" w:color="C9CFD8" w:sz="4"/>
@@ -3867,7 +3997,7 @@
         </w:tc>
         <w:tc>
           <w:tcPr>
-            <w:tcW w:type="dxa" w:w="1724"/>
+            <w:tcW w:type="dxa" w:w="1899"/>
             <w:tcBorders>
               <w:top w:val="single" w:color="C9CFD8" w:sz="4"/>
               <w:left w:val="single" w:color="C9CFD8" w:sz="4"/>
@@ -3893,13 +4023,13 @@
                 <w:sz w:val="17"/>
                 <w:szCs w:val="17"/>
               </w:rPr>
-              <w:t xml:space="preserve">Activités et budget</w:t>
-            </w:r>
-          </w:p>
-        </w:tc>
-        <w:tc>
-          <w:tcPr>
-            <w:tcW w:type="dxa" w:w="4792"/>
+              <w:t xml:space="preserve">Activités et budget, saisie des pièces</w:t>
+            </w:r>
+          </w:p>
+        </w:tc>
+        <w:tc>
+          <w:tcPr>
+            <w:tcW w:type="dxa" w:w="4873"/>
             <w:tcBorders>
               <w:top w:val="single" w:color="C9CFD8" w:sz="4"/>
               <w:left w:val="single" w:color="C9CFD8" w:sz="4"/>
@@ -3925,7 +4055,7 @@
                 <w:sz w:val="17"/>
                 <w:szCs w:val="17"/>
               </w:rPr>
-              <w:t xml:space="preserve">Imputation automatique depuis rotations, chantiers, loyers</w:t>
+              <w:t xml:space="preserve">Imputation automatique depuis rotations, chantiers, loyers, catégories de dépense ; saisie sur plusieurs axes par ligne ; imputation obligatoire contrôlée</w:t>
             </w:r>
           </w:p>
         </w:tc>
@@ -3933,7 +4063,7 @@
       <w:tr>
         <w:tc>
           <w:tcPr>
-            <w:tcW w:type="dxa" w:w="708"/>
+            <w:tcW w:type="dxa" w:w="650"/>
             <w:tcBorders>
               <w:top w:val="single" w:color="C9CFD8" w:sz="4"/>
               <w:left w:val="single" w:color="C9CFD8" w:sz="4"/>
@@ -3964,7 +4094,7 @@
         </w:tc>
         <w:tc>
           <w:tcPr>
-            <w:tcW w:type="dxa" w:w="2415"/>
+            <w:tcW w:type="dxa" w:w="2216"/>
             <w:tcBorders>
               <w:top w:val="single" w:color="C9CFD8" w:sz="4"/>
               <w:left w:val="single" w:color="C9CFD8" w:sz="4"/>
@@ -3995,7 +4125,7 @@
         </w:tc>
         <w:tc>
           <w:tcPr>
-            <w:tcW w:type="dxa" w:w="1724"/>
+            <w:tcW w:type="dxa" w:w="1899"/>
             <w:tcBorders>
               <w:top w:val="single" w:color="C9CFD8" w:sz="4"/>
               <w:left w:val="single" w:color="C9CFD8" w:sz="4"/>
@@ -4026,32 +4156,32 @@
         </w:tc>
         <w:tc>
           <w:tcPr>
-            <w:tcW w:type="dxa" w:w="4792"/>
-            <w:tcBorders>
-              <w:top w:val="single" w:color="C9CFD8" w:sz="4"/>
-              <w:left w:val="single" w:color="C9CFD8" w:sz="4"/>
-              <w:bottom w:val="single" w:color="C9CFD8" w:sz="4"/>
-              <w:right w:val="single" w:color="C9CFD8" w:sz="4"/>
-            </w:tcBorders>
-            <w:tcMar>
-              <w:top w:type="dxa" w:w="50"/>
-              <w:left w:type="dxa" w:w="90"/>
-              <w:bottom w:type="dxa" w:w="50"/>
-              <w:right w:type="dxa" w:w="90"/>
-            </w:tcMar>
-            <w:vAlign w:val="center"/>
-          </w:tcPr>
-          <w:p>
-            <w:pPr>
-              <w:spacing w:after="0"/>
-            </w:pPr>
-            <w:r>
-              <w:rPr>
-                <w:rFonts w:ascii="Calibri" w:cs="Calibri" w:eastAsia="Calibri" w:hAnsi="Calibri"/>
-                <w:sz w:val="17"/>
-                <w:szCs w:val="17"/>
-              </w:rPr>
-              <w:t xml:space="preserve">Import d'un relevé réel, rapprochement des lignes</w:t>
+            <w:tcW w:type="dxa" w:w="4873"/>
+            <w:tcBorders>
+              <w:top w:val="single" w:color="C9CFD8" w:sz="4"/>
+              <w:left w:val="single" w:color="C9CFD8" w:sz="4"/>
+              <w:bottom w:val="single" w:color="C9CFD8" w:sz="4"/>
+              <w:right w:val="single" w:color="C9CFD8" w:sz="4"/>
+            </w:tcBorders>
+            <w:tcMar>
+              <w:top w:type="dxa" w:w="50"/>
+              <w:left w:type="dxa" w:w="90"/>
+              <w:bottom w:type="dxa" w:w="50"/>
+              <w:right w:type="dxa" w:w="90"/>
+            </w:tcMar>
+            <w:vAlign w:val="center"/>
+          </w:tcPr>
+          <w:p>
+            <w:pPr>
+              <w:spacing w:after="0"/>
+            </w:pPr>
+            <w:r>
+              <w:rPr>
+                <w:rFonts w:ascii="Calibri" w:cs="Calibri" w:eastAsia="Calibri" w:hAnsi="Calibri"/>
+                <w:sz w:val="17"/>
+                <w:szCs w:val="17"/>
+              </w:rPr>
+              <w:t xml:space="preserve">Import d'un relevé réel (CSV, XLSX ou camt.053), soldes du relevé contrôlés, rapprochement des lignes, état de rapprochement ; flux mensuels et prévision à trois mois</w:t>
             </w:r>
           </w:p>
         </w:tc>
@@ -4059,7 +4189,7 @@
       <w:tr>
         <w:tc>
           <w:tcPr>
-            <w:tcW w:type="dxa" w:w="708"/>
+            <w:tcW w:type="dxa" w:w="650"/>
             <w:tcBorders>
               <w:top w:val="single" w:color="C9CFD8" w:sz="4"/>
               <w:left w:val="single" w:color="C9CFD8" w:sz="4"/>
@@ -4091,7 +4221,7 @@
         </w:tc>
         <w:tc>
           <w:tcPr>
-            <w:tcW w:type="dxa" w:w="2415"/>
+            <w:tcW w:type="dxa" w:w="2216"/>
             <w:tcBorders>
               <w:top w:val="single" w:color="C9CFD8" w:sz="4"/>
               <w:left w:val="single" w:color="C9CFD8" w:sz="4"/>
@@ -4123,7 +4253,7 @@
         </w:tc>
         <w:tc>
           <w:tcPr>
-            <w:tcW w:type="dxa" w:w="1724"/>
+            <w:tcW w:type="dxa" w:w="1899"/>
             <w:tcBorders>
               <w:top w:val="single" w:color="C9CFD8" w:sz="4"/>
               <w:left w:val="single" w:color="C9CFD8" w:sz="4"/>
@@ -4155,7 +4285,7 @@
         </w:tc>
         <w:tc>
           <w:tcPr>
-            <w:tcW w:type="dxa" w:w="4792"/>
+            <w:tcW w:type="dxa" w:w="4873"/>
             <w:tcBorders>
               <w:top w:val="single" w:color="C9CFD8" w:sz="4"/>
               <w:left w:val="single" w:color="C9CFD8" w:sz="4"/>
@@ -4181,7 +4311,7 @@
                 <w:sz w:val="17"/>
                 <w:szCs w:val="17"/>
               </w:rPr>
-              <w:t xml:space="preserve">Dotations mensuelles automatiques, sortie d'actif (cession)</w:t>
+              <w:t xml:space="preserve">Dotations mensuelles automatiques ventilées par activité, sortie d'actif (cession), registre exporté</w:t>
             </w:r>
           </w:p>
         </w:tc>
@@ -4189,7 +4319,7 @@
       <w:tr>
         <w:tc>
           <w:tcPr>
-            <w:tcW w:type="dxa" w:w="708"/>
+            <w:tcW w:type="dxa" w:w="650"/>
             <w:tcBorders>
               <w:top w:val="single" w:color="C9CFD8" w:sz="4"/>
               <w:left w:val="single" w:color="C9CFD8" w:sz="4"/>
@@ -4220,7 +4350,7 @@
         </w:tc>
         <w:tc>
           <w:tcPr>
-            <w:tcW w:type="dxa" w:w="2415"/>
+            <w:tcW w:type="dxa" w:w="2216"/>
             <w:tcBorders>
               <w:top w:val="single" w:color="C9CFD8" w:sz="4"/>
               <w:left w:val="single" w:color="C9CFD8" w:sz="4"/>
@@ -4251,7 +4381,7 @@
         </w:tc>
         <w:tc>
           <w:tcPr>
-            <w:tcW w:type="dxa" w:w="1724"/>
+            <w:tcW w:type="dxa" w:w="1899"/>
             <w:tcBorders>
               <w:top w:val="single" w:color="C9CFD8" w:sz="4"/>
               <w:left w:val="single" w:color="C9CFD8" w:sz="4"/>
@@ -4282,32 +4412,32 @@
         </w:tc>
         <w:tc>
           <w:tcPr>
-            <w:tcW w:type="dxa" w:w="4792"/>
-            <w:tcBorders>
-              <w:top w:val="single" w:color="C9CFD8" w:sz="4"/>
-              <w:left w:val="single" w:color="C9CFD8" w:sz="4"/>
-              <w:bottom w:val="single" w:color="C9CFD8" w:sz="4"/>
-              <w:right w:val="single" w:color="C9CFD8" w:sz="4"/>
-            </w:tcBorders>
-            <w:tcMar>
-              <w:top w:type="dxa" w:w="50"/>
-              <w:left w:type="dxa" w:w="90"/>
-              <w:bottom w:type="dxa" w:w="50"/>
-              <w:right w:type="dxa" w:w="90"/>
-            </w:tcMar>
-            <w:vAlign w:val="center"/>
-          </w:tcPr>
-          <w:p>
-            <w:pPr>
-              <w:spacing w:after="0"/>
-            </w:pPr>
-            <w:r>
-              <w:rPr>
-                <w:rFonts w:ascii="Calibri" w:cs="Calibri" w:eastAsia="Calibri" w:hAnsi="Calibri"/>
-                <w:sz w:val="17"/>
-                <w:szCs w:val="17"/>
-              </w:rPr>
-              <w:t xml:space="preserve">Budget mensuel, réalisé, écarts, alerte de dépassement</w:t>
+            <w:tcW w:type="dxa" w:w="4873"/>
+            <w:tcBorders>
+              <w:top w:val="single" w:color="C9CFD8" w:sz="4"/>
+              <w:left w:val="single" w:color="C9CFD8" w:sz="4"/>
+              <w:bottom w:val="single" w:color="C9CFD8" w:sz="4"/>
+              <w:right w:val="single" w:color="C9CFD8" w:sz="4"/>
+            </w:tcBorders>
+            <w:tcMar>
+              <w:top w:type="dxa" w:w="50"/>
+              <w:left w:type="dxa" w:w="90"/>
+              <w:bottom w:type="dxa" w:w="50"/>
+              <w:right w:type="dxa" w:w="90"/>
+            </w:tcMar>
+            <w:vAlign w:val="center"/>
+          </w:tcPr>
+          <w:p>
+            <w:pPr>
+              <w:spacing w:after="0"/>
+            </w:pPr>
+            <w:r>
+              <w:rPr>
+                <w:rFonts w:ascii="Calibri" w:cs="Calibri" w:eastAsia="Calibri" w:hAnsi="Calibri"/>
+                <w:sz w:val="17"/>
+                <w:szCs w:val="17"/>
+              </w:rPr>
+              <w:t xml:space="preserve">Budget mensuel par ligne budgétaire, réalisé, engagé, disponible, écarts, alerte de dépassement</w:t>
             </w:r>
           </w:p>
         </w:tc>
@@ -4315,7 +4445,7 @@
       <w:tr>
         <w:tc>
           <w:tcPr>
-            <w:tcW w:type="dxa" w:w="708"/>
+            <w:tcW w:type="dxa" w:w="650"/>
             <w:tcBorders>
               <w:top w:val="single" w:color="C9CFD8" w:sz="4"/>
               <w:left w:val="single" w:color="C9CFD8" w:sz="4"/>
@@ -4347,7 +4477,7 @@
         </w:tc>
         <w:tc>
           <w:tcPr>
-            <w:tcW w:type="dxa" w:w="2415"/>
+            <w:tcW w:type="dxa" w:w="2216"/>
             <w:tcBorders>
               <w:top w:val="single" w:color="C9CFD8" w:sz="4"/>
               <w:left w:val="single" w:color="C9CFD8" w:sz="4"/>
@@ -4379,7 +4509,7 @@
         </w:tc>
         <w:tc>
           <w:tcPr>
-            <w:tcW w:type="dxa" w:w="1724"/>
+            <w:tcW w:type="dxa" w:w="1899"/>
             <w:tcBorders>
               <w:top w:val="single" w:color="C9CFD8" w:sz="4"/>
               <w:left w:val="single" w:color="C9CFD8" w:sz="4"/>
@@ -4411,7 +4541,7 @@
         </w:tc>
         <w:tc>
           <w:tcPr>
-            <w:tcW w:type="dxa" w:w="4792"/>
+            <w:tcW w:type="dxa" w:w="4873"/>
             <w:tcBorders>
               <w:top w:val="single" w:color="C9CFD8" w:sz="4"/>
               <w:left w:val="single" w:color="C9CFD8" w:sz="4"/>
@@ -4437,7 +4567,7 @@
                 <w:sz w:val="17"/>
                 <w:szCs w:val="17"/>
               </w:rPr>
-              <w:t xml:space="preserve">Facture, avoir, échéance, relance</w:t>
+              <w:t xml:space="preserve">Facture, avoir, échéance, relance ; litige qui suspend les relances ; balance âgée clients et fournisseurs</w:t>
             </w:r>
           </w:p>
         </w:tc>
@@ -4445,7 +4575,7 @@
       <w:tr>
         <w:tc>
           <w:tcPr>
-            <w:tcW w:type="dxa" w:w="708"/>
+            <w:tcW w:type="dxa" w:w="650"/>
             <w:tcBorders>
               <w:top w:val="single" w:color="C9CFD8" w:sz="4"/>
               <w:left w:val="single" w:color="C9CFD8" w:sz="4"/>
@@ -4476,7 +4606,7 @@
         </w:tc>
         <w:tc>
           <w:tcPr>
-            <w:tcW w:type="dxa" w:w="2415"/>
+            <w:tcW w:type="dxa" w:w="2216"/>
             <w:tcBorders>
               <w:top w:val="single" w:color="C9CFD8" w:sz="4"/>
               <w:left w:val="single" w:color="C9CFD8" w:sz="4"/>
@@ -4507,7 +4637,7 @@
         </w:tc>
         <w:tc>
           <w:tcPr>
-            <w:tcW w:type="dxa" w:w="1724"/>
+            <w:tcW w:type="dxa" w:w="1899"/>
             <w:tcBorders>
               <w:top w:val="single" w:color="C9CFD8" w:sz="4"/>
               <w:left w:val="single" w:color="C9CFD8" w:sz="4"/>
@@ -4538,32 +4668,32 @@
         </w:tc>
         <w:tc>
           <w:tcPr>
-            <w:tcW w:type="dxa" w:w="4792"/>
-            <w:tcBorders>
-              <w:top w:val="single" w:color="C9CFD8" w:sz="4"/>
-              <w:left w:val="single" w:color="C9CFD8" w:sz="4"/>
-              <w:bottom w:val="single" w:color="C9CFD8" w:sz="4"/>
-              <w:right w:val="single" w:color="C9CFD8" w:sz="4"/>
-            </w:tcBorders>
-            <w:tcMar>
-              <w:top w:type="dxa" w:w="50"/>
-              <w:left w:type="dxa" w:w="90"/>
-              <w:bottom w:type="dxa" w:w="50"/>
-              <w:right w:type="dxa" w:w="90"/>
-            </w:tcMar>
-            <w:vAlign w:val="center"/>
-          </w:tcPr>
-          <w:p>
-            <w:pPr>
-              <w:spacing w:after="0"/>
-            </w:pPr>
-            <w:r>
-              <w:rPr>
-                <w:rFonts w:ascii="Calibri" w:cs="Calibri" w:eastAsia="Calibri" w:hAnsi="Calibri"/>
-                <w:sz w:val="17"/>
-                <w:szCs w:val="17"/>
-              </w:rPr>
-              <w:t xml:space="preserve">TVA du mois rapprochée des écritures, modèle validé par l'expert-comptable</w:t>
+            <w:tcW w:type="dxa" w:w="4873"/>
+            <w:tcBorders>
+              <w:top w:val="single" w:color="C9CFD8" w:sz="4"/>
+              <w:left w:val="single" w:color="C9CFD8" w:sz="4"/>
+              <w:bottom w:val="single" w:color="C9CFD8" w:sz="4"/>
+              <w:right w:val="single" w:color="C9CFD8" w:sz="4"/>
+            </w:tcBorders>
+            <w:tcMar>
+              <w:top w:type="dxa" w:w="50"/>
+              <w:left w:type="dxa" w:w="90"/>
+              <w:bottom w:type="dxa" w:w="50"/>
+              <w:right w:type="dxa" w:w="90"/>
+            </w:tcMar>
+            <w:vAlign w:val="center"/>
+          </w:tcPr>
+          <w:p>
+            <w:pPr>
+              <w:spacing w:after="0"/>
+            </w:pPr>
+            <w:r>
+              <w:rPr>
+                <w:rFonts w:ascii="Calibri" w:cs="Calibri" w:eastAsia="Calibri" w:hAnsi="Calibri"/>
+                <w:sz w:val="17"/>
+                <w:szCs w:val="17"/>
+              </w:rPr>
+              <w:t xml:space="preserve">TVA du mois rapprochée des écritures et liquidée à la clôture, retenues à la source, déclarations et historique, modèle validé par l'expert-comptable</w:t>
             </w:r>
           </w:p>
         </w:tc>
@@ -4571,7 +4701,7 @@
       <w:tr>
         <w:tc>
           <w:tcPr>
-            <w:tcW w:type="dxa" w:w="708"/>
+            <w:tcW w:type="dxa" w:w="650"/>
             <w:tcBorders>
               <w:top w:val="single" w:color="C9CFD8" w:sz="4"/>
               <w:left w:val="single" w:color="C9CFD8" w:sz="4"/>
@@ -4603,7 +4733,7 @@
         </w:tc>
         <w:tc>
           <w:tcPr>
-            <w:tcW w:type="dxa" w:w="2415"/>
+            <w:tcW w:type="dxa" w:w="2216"/>
             <w:tcBorders>
               <w:top w:val="single" w:color="C9CFD8" w:sz="4"/>
               <w:left w:val="single" w:color="C9CFD8" w:sz="4"/>
@@ -4635,7 +4765,7 @@
         </w:tc>
         <w:tc>
           <w:tcPr>
-            <w:tcW w:type="dxa" w:w="1724"/>
+            <w:tcW w:type="dxa" w:w="1899"/>
             <w:tcBorders>
               <w:top w:val="single" w:color="C9CFD8" w:sz="4"/>
               <w:left w:val="single" w:color="C9CFD8" w:sz="4"/>
@@ -4661,13 +4791,13 @@
                 <w:sz w:val="17"/>
                 <w:szCs w:val="17"/>
               </w:rPr>
-              <w:t xml:space="preserve">À valider</w:t>
-            </w:r>
-          </w:p>
-        </w:tc>
-        <w:tc>
-          <w:tcPr>
-            <w:tcW w:type="dxa" w:w="4792"/>
+              <w:t xml:space="preserve">Engagements, À valider</w:t>
+            </w:r>
+          </w:p>
+        </w:tc>
+        <w:tc>
+          <w:tcPr>
+            <w:tcW w:type="dxa" w:w="4873"/>
             <w:tcBorders>
               <w:top w:val="single" w:color="C9CFD8" w:sz="4"/>
               <w:left w:val="single" w:color="C9CFD8" w:sz="4"/>
@@ -4693,7 +4823,7 @@
                 <w:sz w:val="17"/>
                 <w:szCs w:val="17"/>
               </w:rPr>
-              <w:t xml:space="preserve">Pièce au-delà du seuil bloquée jusqu'à approbation</w:t>
+              <w:t xml:space="preserve">Engagement approuvé avant la commande ; pièce, règlement ou décaissement au-delà du seuil bloqué jusqu'à approbation</w:t>
             </w:r>
           </w:p>
         </w:tc>
@@ -4701,7 +4831,7 @@
       <w:tr>
         <w:tc>
           <w:tcPr>
-            <w:tcW w:type="dxa" w:w="708"/>
+            <w:tcW w:type="dxa" w:w="650"/>
             <w:tcBorders>
               <w:top w:val="single" w:color="C9CFD8" w:sz="4"/>
               <w:left w:val="single" w:color="C9CFD8" w:sz="4"/>
@@ -4732,7 +4862,7 @@
         </w:tc>
         <w:tc>
           <w:tcPr>
-            <w:tcW w:type="dxa" w:w="2415"/>
+            <w:tcW w:type="dxa" w:w="2216"/>
             <w:tcBorders>
               <w:top w:val="single" w:color="C9CFD8" w:sz="4"/>
               <w:left w:val="single" w:color="C9CFD8" w:sz="4"/>
@@ -4763,7 +4893,7 @@
         </w:tc>
         <w:tc>
           <w:tcPr>
-            <w:tcW w:type="dxa" w:w="1724"/>
+            <w:tcW w:type="dxa" w:w="1899"/>
             <w:tcBorders>
               <w:top w:val="single" w:color="C9CFD8" w:sz="4"/>
               <w:left w:val="single" w:color="C9CFD8" w:sz="4"/>
@@ -4794,32 +4924,32 @@
         </w:tc>
         <w:tc>
           <w:tcPr>
-            <w:tcW w:type="dxa" w:w="4792"/>
-            <w:tcBorders>
-              <w:top w:val="single" w:color="C9CFD8" w:sz="4"/>
-              <w:left w:val="single" w:color="C9CFD8" w:sz="4"/>
-              <w:bottom w:val="single" w:color="C9CFD8" w:sz="4"/>
-              <w:right w:val="single" w:color="C9CFD8" w:sz="4"/>
-            </w:tcBorders>
-            <w:tcMar>
-              <w:top w:type="dxa" w:w="50"/>
-              <w:left w:type="dxa" w:w="90"/>
-              <w:bottom w:type="dxa" w:w="50"/>
-              <w:right w:type="dxa" w:w="90"/>
-            </w:tcMar>
-            <w:vAlign w:val="center"/>
-          </w:tcPr>
-          <w:p>
-            <w:pPr>
-              <w:spacing w:after="0"/>
-            </w:pPr>
-            <w:r>
-              <w:rPr>
-                <w:rFonts w:ascii="Calibri" w:cs="Calibri" w:eastAsia="Calibri" w:hAnsi="Calibri"/>
-                <w:sz w:val="17"/>
-                <w:szCs w:val="17"/>
-              </w:rPr>
-              <w:t xml:space="preserve">Rotation saisie au parc hors réseau, marge par ensemble et par route</w:t>
+            <w:tcW w:type="dxa" w:w="4873"/>
+            <w:tcBorders>
+              <w:top w:val="single" w:color="C9CFD8" w:sz="4"/>
+              <w:left w:val="single" w:color="C9CFD8" w:sz="4"/>
+              <w:bottom w:val="single" w:color="C9CFD8" w:sz="4"/>
+              <w:right w:val="single" w:color="C9CFD8" w:sz="4"/>
+            </w:tcBorders>
+            <w:tcMar>
+              <w:top w:type="dxa" w:w="50"/>
+              <w:left w:type="dxa" w:w="90"/>
+              <w:bottom w:type="dxa" w:w="50"/>
+              <w:right w:type="dxa" w:w="90"/>
+            </w:tcMar>
+            <w:vAlign w:val="center"/>
+          </w:tcPr>
+          <w:p>
+            <w:pPr>
+              <w:spacing w:after="0"/>
+            </w:pPr>
+            <w:r>
+              <w:rPr>
+                <w:rFonts w:ascii="Calibri" w:cs="Calibri" w:eastAsia="Calibri" w:hAnsi="Calibri"/>
+                <w:sz w:val="17"/>
+                <w:szCs w:val="17"/>
+              </w:rPr>
+              <w:t xml:space="preserve">Rotation saisie au parc hors réseau, marge par ensemble et par route, coût au km, charges de structure ; volumes, manquants et taxes spécifiques au barème</w:t>
             </w:r>
           </w:p>
         </w:tc>
@@ -4827,7 +4957,7 @@
       <w:tr>
         <w:tc>
           <w:tcPr>
-            <w:tcW w:type="dxa" w:w="708"/>
+            <w:tcW w:type="dxa" w:w="650"/>
             <w:tcBorders>
               <w:top w:val="single" w:color="C9CFD8" w:sz="4"/>
               <w:left w:val="single" w:color="C9CFD8" w:sz="4"/>
@@ -4859,7 +4989,7 @@
         </w:tc>
         <w:tc>
           <w:tcPr>
-            <w:tcW w:type="dxa" w:w="2415"/>
+            <w:tcW w:type="dxa" w:w="2216"/>
             <w:tcBorders>
               <w:top w:val="single" w:color="C9CFD8" w:sz="4"/>
               <w:left w:val="single" w:color="C9CFD8" w:sz="4"/>
@@ -4891,7 +5021,7 @@
         </w:tc>
         <w:tc>
           <w:tcPr>
-            <w:tcW w:type="dxa" w:w="1724"/>
+            <w:tcW w:type="dxa" w:w="1899"/>
             <w:tcBorders>
               <w:top w:val="single" w:color="C9CFD8" w:sz="4"/>
               <w:left w:val="single" w:color="C9CFD8" w:sz="4"/>
@@ -4923,7 +5053,7 @@
         </w:tc>
         <w:tc>
           <w:tcPr>
-            <w:tcW w:type="dxa" w:w="4792"/>
+            <w:tcW w:type="dxa" w:w="4873"/>
             <w:tcBorders>
               <w:top w:val="single" w:color="C9CFD8" w:sz="4"/>
               <w:left w:val="single" w:color="C9CFD8" w:sz="4"/>
@@ -4957,7 +5087,7 @@
       <w:tr>
         <w:tc>
           <w:tcPr>
-            <w:tcW w:type="dxa" w:w="708"/>
+            <w:tcW w:type="dxa" w:w="650"/>
             <w:tcBorders>
               <w:top w:val="single" w:color="C9CFD8" w:sz="4"/>
               <w:left w:val="single" w:color="C9CFD8" w:sz="4"/>
@@ -4988,7 +5118,7 @@
         </w:tc>
         <w:tc>
           <w:tcPr>
-            <w:tcW w:type="dxa" w:w="2415"/>
+            <w:tcW w:type="dxa" w:w="2216"/>
             <w:tcBorders>
               <w:top w:val="single" w:color="C9CFD8" w:sz="4"/>
               <w:left w:val="single" w:color="C9CFD8" w:sz="4"/>
@@ -5019,7 +5149,7 @@
         </w:tc>
         <w:tc>
           <w:tcPr>
-            <w:tcW w:type="dxa" w:w="1724"/>
+            <w:tcW w:type="dxa" w:w="1899"/>
             <w:tcBorders>
               <w:top w:val="single" w:color="C9CFD8" w:sz="4"/>
               <w:left w:val="single" w:color="C9CFD8" w:sz="4"/>
@@ -5050,7 +5180,7 @@
         </w:tc>
         <w:tc>
           <w:tcPr>
-            <w:tcW w:type="dxa" w:w="4792"/>
+            <w:tcW w:type="dxa" w:w="4873"/>
             <w:tcBorders>
               <w:top w:val="single" w:color="C9CFD8" w:sz="4"/>
               <w:left w:val="single" w:color="C9CFD8" w:sz="4"/>
@@ -5083,7 +5213,7 @@
       <w:tr>
         <w:tc>
           <w:tcPr>
-            <w:tcW w:type="dxa" w:w="708"/>
+            <w:tcW w:type="dxa" w:w="650"/>
             <w:tcBorders>
               <w:top w:val="single" w:color="C9CFD8" w:sz="4"/>
               <w:left w:val="single" w:color="C9CFD8" w:sz="4"/>
@@ -5115,7 +5245,7 @@
         </w:tc>
         <w:tc>
           <w:tcPr>
-            <w:tcW w:type="dxa" w:w="2415"/>
+            <w:tcW w:type="dxa" w:w="2216"/>
             <w:tcBorders>
               <w:top w:val="single" w:color="C9CFD8" w:sz="4"/>
               <w:left w:val="single" w:color="C9CFD8" w:sz="4"/>
@@ -5147,7 +5277,7 @@
         </w:tc>
         <w:tc>
           <w:tcPr>
-            <w:tcW w:type="dxa" w:w="1724"/>
+            <w:tcW w:type="dxa" w:w="1899"/>
             <w:tcBorders>
               <w:top w:val="single" w:color="C9CFD8" w:sz="4"/>
               <w:left w:val="single" w:color="C9CFD8" w:sz="4"/>
@@ -5179,7 +5309,7 @@
         </w:tc>
         <w:tc>
           <w:tcPr>
-            <w:tcW w:type="dxa" w:w="4792"/>
+            <w:tcW w:type="dxa" w:w="4873"/>
             <w:tcBorders>
               <w:top w:val="single" w:color="C9CFD8" w:sz="4"/>
               <w:left w:val="single" w:color="C9CFD8" w:sz="4"/>
@@ -5213,7 +5343,7 @@
       <w:tr>
         <w:tc>
           <w:tcPr>
-            <w:tcW w:type="dxa" w:w="708"/>
+            <w:tcW w:type="dxa" w:w="650"/>
             <w:tcBorders>
               <w:top w:val="single" w:color="C9CFD8" w:sz="4"/>
               <w:left w:val="single" w:color="C9CFD8" w:sz="4"/>
@@ -5244,7 +5374,7 @@
         </w:tc>
         <w:tc>
           <w:tcPr>
-            <w:tcW w:type="dxa" w:w="2415"/>
+            <w:tcW w:type="dxa" w:w="2216"/>
             <w:tcBorders>
               <w:top w:val="single" w:color="C9CFD8" w:sz="4"/>
               <w:left w:val="single" w:color="C9CFD8" w:sz="4"/>
@@ -5275,7 +5405,7 @@
         </w:tc>
         <w:tc>
           <w:tcPr>
-            <w:tcW w:type="dxa" w:w="1724"/>
+            <w:tcW w:type="dxa" w:w="1899"/>
             <w:tcBorders>
               <w:top w:val="single" w:color="C9CFD8" w:sz="4"/>
               <w:left w:val="single" w:color="C9CFD8" w:sz="4"/>
@@ -5306,7 +5436,7 @@
         </w:tc>
         <w:tc>
           <w:tcPr>
-            <w:tcW w:type="dxa" w:w="4792"/>
+            <w:tcW w:type="dxa" w:w="4873"/>
             <w:tcBorders>
               <w:top w:val="single" w:color="C9CFD8" w:sz="4"/>
               <w:left w:val="single" w:color="C9CFD8" w:sz="4"/>
@@ -5339,7 +5469,7 @@
       <w:tr>
         <w:tc>
           <w:tcPr>
-            <w:tcW w:type="dxa" w:w="708"/>
+            <w:tcW w:type="dxa" w:w="650"/>
             <w:tcBorders>
               <w:top w:val="single" w:color="C9CFD8" w:sz="4"/>
               <w:left w:val="single" w:color="C9CFD8" w:sz="4"/>
@@ -5371,7 +5501,7 @@
         </w:tc>
         <w:tc>
           <w:tcPr>
-            <w:tcW w:type="dxa" w:w="2415"/>
+            <w:tcW w:type="dxa" w:w="2216"/>
             <w:tcBorders>
               <w:top w:val="single" w:color="C9CFD8" w:sz="4"/>
               <w:left w:val="single" w:color="C9CFD8" w:sz="4"/>
@@ -5403,7 +5533,7 @@
         </w:tc>
         <w:tc>
           <w:tcPr>
-            <w:tcW w:type="dxa" w:w="1724"/>
+            <w:tcW w:type="dxa" w:w="1899"/>
             <w:tcBorders>
               <w:top w:val="single" w:color="C9CFD8" w:sz="4"/>
               <w:left w:val="single" w:color="C9CFD8" w:sz="4"/>
@@ -5435,7 +5565,7 @@
         </w:tc>
         <w:tc>
           <w:tcPr>
-            <w:tcW w:type="dxa" w:w="4792"/>
+            <w:tcW w:type="dxa" w:w="4873"/>
             <w:tcBorders>
               <w:top w:val="single" w:color="C9CFD8" w:sz="4"/>
               <w:left w:val="single" w:color="C9CFD8" w:sz="4"/>
@@ -5469,7 +5599,7 @@
       <w:tr>
         <w:tc>
           <w:tcPr>
-            <w:tcW w:type="dxa" w:w="708"/>
+            <w:tcW w:type="dxa" w:w="650"/>
             <w:tcBorders>
               <w:top w:val="single" w:color="C9CFD8" w:sz="4"/>
               <w:left w:val="single" w:color="C9CFD8" w:sz="4"/>
@@ -5500,7 +5630,7 @@
         </w:tc>
         <w:tc>
           <w:tcPr>
-            <w:tcW w:type="dxa" w:w="2415"/>
+            <w:tcW w:type="dxa" w:w="2216"/>
             <w:tcBorders>
               <w:top w:val="single" w:color="C9CFD8" w:sz="4"/>
               <w:left w:val="single" w:color="C9CFD8" w:sz="4"/>
@@ -5531,7 +5661,7 @@
         </w:tc>
         <w:tc>
           <w:tcPr>
-            <w:tcW w:type="dxa" w:w="1724"/>
+            <w:tcW w:type="dxa" w:w="1899"/>
             <w:tcBorders>
               <w:top w:val="single" w:color="C9CFD8" w:sz="4"/>
               <w:left w:val="single" w:color="C9CFD8" w:sz="4"/>
@@ -5562,7 +5692,7 @@
         </w:tc>
         <w:tc>
           <w:tcPr>
-            <w:tcW w:type="dxa" w:w="4792"/>
+            <w:tcW w:type="dxa" w:w="4873"/>
             <w:tcBorders>
               <w:top w:val="single" w:color="C9CFD8" w:sz="4"/>
               <w:left w:val="single" w:color="C9CFD8" w:sz="4"/>
@@ -5595,7 +5725,7 @@
       <w:tr>
         <w:tc>
           <w:tcPr>
-            <w:tcW w:type="dxa" w:w="708"/>
+            <w:tcW w:type="dxa" w:w="650"/>
             <w:tcBorders>
               <w:top w:val="single" w:color="C9CFD8" w:sz="4"/>
               <w:left w:val="single" w:color="C9CFD8" w:sz="4"/>
@@ -5627,7 +5757,7 @@
         </w:tc>
         <w:tc>
           <w:tcPr>
-            <w:tcW w:type="dxa" w:w="2415"/>
+            <w:tcW w:type="dxa" w:w="2216"/>
             <w:tcBorders>
               <w:top w:val="single" w:color="C9CFD8" w:sz="4"/>
               <w:left w:val="single" w:color="C9CFD8" w:sz="4"/>
@@ -5659,7 +5789,7 @@
         </w:tc>
         <w:tc>
           <w:tcPr>
-            <w:tcW w:type="dxa" w:w="1724"/>
+            <w:tcW w:type="dxa" w:w="1899"/>
             <w:tcBorders>
               <w:top w:val="single" w:color="C9CFD8" w:sz="4"/>
               <w:left w:val="single" w:color="C9CFD8" w:sz="4"/>
@@ -5691,7 +5821,7 @@
         </w:tc>
         <w:tc>
           <w:tcPr>
-            <w:tcW w:type="dxa" w:w="4792"/>
+            <w:tcW w:type="dxa" w:w="4873"/>
             <w:tcBorders>
               <w:top w:val="single" w:color="C9CFD8" w:sz="4"/>
               <w:left w:val="single" w:color="C9CFD8" w:sz="4"/>
@@ -5725,7 +5855,7 @@
       <w:tr>
         <w:tc>
           <w:tcPr>
-            <w:tcW w:type="dxa" w:w="708"/>
+            <w:tcW w:type="dxa" w:w="650"/>
             <w:tcBorders>
               <w:top w:val="single" w:color="C9CFD8" w:sz="4"/>
               <w:left w:val="single" w:color="C9CFD8" w:sz="4"/>
@@ -5756,7 +5886,7 @@
         </w:tc>
         <w:tc>
           <w:tcPr>
-            <w:tcW w:type="dxa" w:w="2415"/>
+            <w:tcW w:type="dxa" w:w="2216"/>
             <w:tcBorders>
               <w:top w:val="single" w:color="C9CFD8" w:sz="4"/>
               <w:left w:val="single" w:color="C9CFD8" w:sz="4"/>
@@ -5787,7 +5917,7 @@
         </w:tc>
         <w:tc>
           <w:tcPr>
-            <w:tcW w:type="dxa" w:w="1724"/>
+            <w:tcW w:type="dxa" w:w="1899"/>
             <w:tcBorders>
               <w:top w:val="single" w:color="C9CFD8" w:sz="4"/>
               <w:left w:val="single" w:color="C9CFD8" w:sz="4"/>
@@ -5818,7 +5948,7 @@
         </w:tc>
         <w:tc>
           <w:tcPr>
-            <w:tcW w:type="dxa" w:w="4792"/>
+            <w:tcW w:type="dxa" w:w="4873"/>
             <w:tcBorders>
               <w:top w:val="single" w:color="C9CFD8" w:sz="4"/>
               <w:left w:val="single" w:color="C9CFD8" w:sz="4"/>
@@ -5851,7 +5981,7 @@
       <w:tr>
         <w:tc>
           <w:tcPr>
-            <w:tcW w:type="dxa" w:w="708"/>
+            <w:tcW w:type="dxa" w:w="650"/>
             <w:tcBorders>
               <w:top w:val="single" w:color="C9CFD8" w:sz="4"/>
               <w:left w:val="single" w:color="C9CFD8" w:sz="4"/>
@@ -5883,7 +6013,7 @@
         </w:tc>
         <w:tc>
           <w:tcPr>
-            <w:tcW w:type="dxa" w:w="2415"/>
+            <w:tcW w:type="dxa" w:w="2216"/>
             <w:tcBorders>
               <w:top w:val="single" w:color="C9CFD8" w:sz="4"/>
               <w:left w:val="single" w:color="C9CFD8" w:sz="4"/>
@@ -5915,7 +6045,7 @@
         </w:tc>
         <w:tc>
           <w:tcPr>
-            <w:tcW w:type="dxa" w:w="1724"/>
+            <w:tcW w:type="dxa" w:w="1899"/>
             <w:tcBorders>
               <w:top w:val="single" w:color="C9CFD8" w:sz="4"/>
               <w:left w:val="single" w:color="C9CFD8" w:sz="4"/>
@@ -5947,7 +6077,7 @@
         </w:tc>
         <w:tc>
           <w:tcPr>
-            <w:tcW w:type="dxa" w:w="4792"/>
+            <w:tcW w:type="dxa" w:w="4873"/>
             <w:tcBorders>
               <w:top w:val="single" w:color="C9CFD8" w:sz="4"/>
               <w:left w:val="single" w:color="C9CFD8" w:sz="4"/>

</xml_diff>

<commit_message>
Dossier de conception : faits du 25 octobre (mises à jour mensuelles, réversibilité, reprise hors site, rotations)
Mises à jour de sécurité mensuelles des composants, en recette puis en production (offre 5.3) ;
outil d'export de réversibilité (5.4) ; reprise depuis la copie hors site, qui mesurera le vrai
délai de reprise, à jouer dès sa mise en service ; 15 jours de journaux hors site ; disponibilité
hors maintenances annoncées ; contrôle de cohérence des références à la clôture ; validation d'une
rotation par un autre compte que celui qui l'a saisie (décision du 22 octobre, code du 25). Word
régénéré.

Co-Authored-By: Claude Opus 5.5 <noreply@anthropic.com>
</commit_message>
<xml_diff>
--- a/docs/projet/Dossier_de_conception.docx
+++ b/docs/projet/Dossier_de_conception.docx
@@ -6410,6 +6410,20 @@
     </w:p>
     <w:p>
       <w:pPr>
+        <w:spacing w:after="100"/>
+        <w:jc w:val="both"/>
+      </w:pPr>
+      <w:r>
+        <w:rPr>
+          <w:rFonts w:ascii="Calibri" w:cs="Calibri" w:eastAsia="Calibri" w:hAnsi="Calibri"/>
+          <w:sz w:val="20"/>
+          <w:szCs w:val="20"/>
+        </w:rPr>
+        <w:t xml:space="preserve">Décidé le 22 octobre 2026 et ajouté au code le 25 octobre : une rotation est validée par un autre compte que celui qui l'a saisie.</w:t>
+      </w:r>
+    </w:p>
+    <w:p>
+      <w:pPr>
         <w:keepNext/>
         <w:pBdr>
           <w:bottom w:val="single" w:color="1A9E9E" w:sz="6" w:space="2"/>
@@ -6982,7 +6996,7 @@
                 <w:sz w:val="17"/>
                 <w:szCs w:val="17"/>
               </w:rPr>
-              <w:t xml:space="preserve">contrôles bloquants (équilibres, compte de passage, pièces en attente, relevés rapprochés), verrouillage et empreinte de chaînage des écritures, réouverture tracée</w:t>
+              <w:t xml:space="preserve">contrôles bloquants (équilibres, compte de passage, pièces en attente, relevés rapprochés), verrouillage et empreinte de chaînage des écritures, réouverture tracée ; cohérence des références (référence de fournisseur saisie deux fois, numéros manquants dans les factures et avoirs du mois), en vigilance</w:t>
             </w:r>
           </w:p>
         </w:tc>
@@ -8342,7 +8356,7 @@
                 <w:sz w:val="17"/>
                 <w:szCs w:val="17"/>
               </w:rPr>
-              <w:t xml:space="preserve">14 jours sur le serveur ; les rétentions de l'offre s'appliqueront à la copie hors site</w:t>
+              <w:t xml:space="preserve">14 jours sur le serveur ; les rétentions de l'offre s'appliqueront à la copie hors site (15 jours de journaux gardés pour 14 jours complets de restauration)</w:t>
             </w:r>
           </w:p>
         </w:tc>
@@ -8535,7 +8549,7 @@
                 <w:sz w:val="17"/>
                 <w:szCs w:val="17"/>
               </w:rPr>
-              <w:t xml:space="preserve">procédure écrite ; restauration du 25 octobre faite en 15 secondes, sur une base encore vide</w:t>
+              <w:t xml:space="preserve">procédure écrite ; restauration du 25 octobre faite en 15 secondes, sur une base encore vide ; la reprise depuis la copie hors site, qui mesure le vrai délai, se jouera dès sa mise en service</w:t>
             </w:r>
           </w:p>
         </w:tc>
@@ -8728,7 +8742,7 @@
                 <w:sz w:val="17"/>
                 <w:szCs w:val="17"/>
               </w:rPr>
-              <w:t xml:space="preserve">mesurée chaque mois sur le journal de la supervision</w:t>
+              <w:t xml:space="preserve">mesurée chaque mois sur le journal de la supervision, hors maintenances annoncées 48 heures à l'avance</w:t>
             </w:r>
           </w:p>
         </w:tc>
@@ -8778,7 +8792,21 @@
           <w:sz w:val="20"/>
           <w:szCs w:val="20"/>
         </w:rPr>
-        <w:t xml:space="preserve">Mises à jour de sécurité : celles du système s'appliquent automatiquement, sans redémarrage automatique ; celles des composants de la plateforme passent par la recette puis par la procédure de mise en production.</w:t>
+        <w:t xml:space="preserve">Mises à jour de sécurité : celles du système s'appliquent chaque nuit, sans redémarrage automatique. Celles des composants (noyau, base de données, applications web, proxy) se font chaque mois, en recette puis en production, annoncées 48 heures à l'avance, avec un compte rendu du mois (offre, chapitre 5.3) ; la procédure est outillée.</w:t>
+      </w:r>
+    </w:p>
+    <w:p>
+      <w:pPr>
+        <w:spacing w:after="100"/>
+        <w:jc w:val="both"/>
+      </w:pPr>
+      <w:r>
+        <w:rPr>
+          <w:rFonts w:ascii="Calibri" w:cs="Calibri" w:eastAsia="Calibri" w:hAnsi="Calibri"/>
+          <w:sz w:val="20"/>
+          <w:szCs w:val="20"/>
+        </w:rPr>
+        <w:t xml:space="preserve">Réversibilité (offre, chapitre 5.4) : un outil produit en une fois la copie complète remise au client, en formats ouverts : base en SQL, pièces jointes, code de la version en service, configuration de déploiement sans secret, notice de réinstallation.</w:t>
       </w:r>
     </w:p>
     <w:p>

</xml_diff>